<commit_message>
Update changepoint results table
</commit_message>
<xml_diff>
--- a/output/tables/changepoint_table.docx
+++ b/output/tables/changepoint_table.docx
@@ -433,7 +433,7 @@
                 <w:szCs w:val="24"/>
                 <w:color w:val="000000"/>
               </w:rPr>
-              <w:t xml:space="preserve">GP</w:t>
+              <w:t xml:space="preserve">FOI</w:t>
             </w:r>
           </w:p>
         </w:tc>
@@ -598,7 +598,7 @@
                 <w:szCs w:val="24"/>
                 <w:color w:val="000000"/>
               </w:rPr>
-              <w:t xml:space="preserve">0.54% (0.48% to 0.59%)</w:t>
+              <w:t xml:space="preserve">1.76% (1.41% to 2.11%)</w:t>
             </w:r>
           </w:p>
         </w:tc>
@@ -708,7 +708,7 @@
                 <w:szCs w:val="24"/>
                 <w:color w:val="000000"/>
               </w:rPr>
-              <w:t xml:space="preserve"/>
+              <w:t xml:space="preserve">&lt;0.001</w:t>
             </w:r>
           </w:p>
         </w:tc>
@@ -768,7 +768,7 @@
                 <w:szCs w:val="24"/>
                 <w:color w:val="000000"/>
               </w:rPr>
-              <w:t xml:space="preserve">GP</w:t>
+              <w:t xml:space="preserve">FOI</w:t>
             </w:r>
           </w:p>
         </w:tc>
@@ -878,7 +878,7 @@
                 <w:szCs w:val="24"/>
                 <w:color w:val="000000"/>
               </w:rPr>
-              <w:t xml:space="preserve">2018-04-01 (2017-04-01 to 2019-03-01)</w:t>
+              <w:t xml:space="preserve">2020-08-01 (2020-05-01 to 2020-10-01)</w:t>
             </w:r>
           </w:p>
         </w:tc>
@@ -933,7 +933,7 @@
                 <w:szCs w:val="24"/>
                 <w:color w:val="000000"/>
               </w:rPr>
-              <w:t xml:space="preserve">0.79% (0.7% to 0.89%)</w:t>
+              <w:t xml:space="preserve">20.38% (4.03% to 39.29%)</w:t>
             </w:r>
           </w:p>
         </w:tc>
@@ -988,7 +988,7 @@
                 <w:szCs w:val="24"/>
                 <w:color w:val="000000"/>
               </w:rPr>
-              <w:t xml:space="preserve">0.25% (0.15% to 0.36%)</w:t>
+              <w:t xml:space="preserve">18.3% (2.23% to 36.89%)</w:t>
             </w:r>
           </w:p>
         </w:tc>
@@ -1043,7 +1043,7 @@
                 <w:szCs w:val="24"/>
                 <w:color w:val="000000"/>
               </w:rPr>
-              <w:t xml:space="preserve">&lt;0.001</w:t>
+              <w:t xml:space="preserve">0.098</w:t>
             </w:r>
           </w:p>
         </w:tc>
@@ -1103,7 +1103,7 @@
                 <w:szCs w:val="24"/>
                 <w:color w:val="000000"/>
               </w:rPr>
-              <w:t xml:space="preserve">GP</w:t>
+              <w:t xml:space="preserve">FOI</w:t>
             </w:r>
           </w:p>
         </w:tc>
@@ -1213,7 +1213,7 @@
                 <w:szCs w:val="24"/>
                 <w:color w:val="000000"/>
               </w:rPr>
-              <w:t xml:space="preserve">2021-02-01 (2020-07-01 to 2021-08-01)</w:t>
+              <w:t xml:space="preserve">2020-12-01 (2020-09-01 to 2021-02-01)</w:t>
             </w:r>
           </w:p>
         </w:tc>
@@ -1268,7 +1268,7 @@
                 <w:szCs w:val="24"/>
                 <w:color w:val="000000"/>
               </w:rPr>
-              <w:t xml:space="preserve">1.2% (1.16% to 1.24%)</w:t>
+              <w:t xml:space="preserve">4.32% (3.91% to 4.73%)</w:t>
             </w:r>
           </w:p>
         </w:tc>
@@ -1323,7 +1323,7 @@
                 <w:szCs w:val="24"/>
                 <w:color w:val="000000"/>
               </w:rPr>
-              <w:t xml:space="preserve">0.4% (0.3% to 0.51%)</w:t>
+              <w:t xml:space="preserve">-13.34% (-25.11% to 0.28%)</w:t>
             </w:r>
           </w:p>
         </w:tc>
@@ -1378,7 +1378,7 @@
                 <w:szCs w:val="24"/>
                 <w:color w:val="000000"/>
               </w:rPr>
-              <w:t xml:space="preserve">&lt;0.001</w:t>
+              <w:t xml:space="preserve">0.163</w:t>
             </w:r>
           </w:p>
         </w:tc>
@@ -1438,7 +1438,7 @@
                 <w:szCs w:val="24"/>
                 <w:color w:val="000000"/>
               </w:rPr>
-              <w:t xml:space="preserve">FOI</w:t>
+              <w:t xml:space="preserve">GP</w:t>
             </w:r>
           </w:p>
         </w:tc>
@@ -1603,7 +1603,7 @@
                 <w:szCs w:val="24"/>
                 <w:color w:val="000000"/>
               </w:rPr>
-              <w:t xml:space="preserve">1.76% (1.41% to 2.11%)</w:t>
+              <w:t xml:space="preserve">0.54% (0.48% to 0.59%)</w:t>
             </w:r>
           </w:p>
         </w:tc>
@@ -1713,7 +1713,7 @@
                 <w:szCs w:val="24"/>
                 <w:color w:val="000000"/>
               </w:rPr>
-              <w:t xml:space="preserve"/>
+              <w:t xml:space="preserve">&lt;0.001</w:t>
             </w:r>
           </w:p>
         </w:tc>
@@ -1773,7 +1773,7 @@
                 <w:szCs w:val="24"/>
                 <w:color w:val="000000"/>
               </w:rPr>
-              <w:t xml:space="preserve">FOI</w:t>
+              <w:t xml:space="preserve">GP</w:t>
             </w:r>
           </w:p>
         </w:tc>
@@ -1883,7 +1883,7 @@
                 <w:szCs w:val="24"/>
                 <w:color w:val="000000"/>
               </w:rPr>
-              <w:t xml:space="preserve">2020-08-01 (2020-05-01 to 2020-10-01)</w:t>
+              <w:t xml:space="preserve">2018-04-01 (2017-04-01 to 2019-03-01)</w:t>
             </w:r>
           </w:p>
         </w:tc>
@@ -1938,7 +1938,7 @@
                 <w:szCs w:val="24"/>
                 <w:color w:val="000000"/>
               </w:rPr>
-              <w:t xml:space="preserve">20.38% (4.03% to 39.29%)</w:t>
+              <w:t xml:space="preserve">0.79% (0.7% to 0.89%)</w:t>
             </w:r>
           </w:p>
         </w:tc>
@@ -1993,7 +1993,7 @@
                 <w:szCs w:val="24"/>
                 <w:color w:val="000000"/>
               </w:rPr>
-              <w:t xml:space="preserve">18.3% (2.23% to 36.89%)</w:t>
+              <w:t xml:space="preserve">0.25% (0.15% to 0.36%)</w:t>
             </w:r>
           </w:p>
         </w:tc>
@@ -2048,7 +2048,7 @@
                 <w:szCs w:val="24"/>
                 <w:color w:val="000000"/>
               </w:rPr>
-              <w:t xml:space="preserve">0.098</w:t>
+              <w:t xml:space="preserve">&lt;0.001</w:t>
             </w:r>
           </w:p>
         </w:tc>
@@ -2108,7 +2108,7 @@
                 <w:szCs w:val="24"/>
                 <w:color w:val="000000"/>
               </w:rPr>
-              <w:t xml:space="preserve">FOI</w:t>
+              <w:t xml:space="preserve">GP</w:t>
             </w:r>
           </w:p>
         </w:tc>
@@ -2218,7 +2218,7 @@
                 <w:szCs w:val="24"/>
                 <w:color w:val="000000"/>
               </w:rPr>
-              <w:t xml:space="preserve">2020-12-01 (2020-09-01 to 2021-02-01)</w:t>
+              <w:t xml:space="preserve">2021-02-01 (2020-07-01 to 2021-08-01)</w:t>
             </w:r>
           </w:p>
         </w:tc>
@@ -2273,7 +2273,7 @@
                 <w:szCs w:val="24"/>
                 <w:color w:val="000000"/>
               </w:rPr>
-              <w:t xml:space="preserve">4.32% (3.91% to 4.73%)</w:t>
+              <w:t xml:space="preserve">1.2% (1.16% to 1.24%)</w:t>
             </w:r>
           </w:p>
         </w:tc>
@@ -2328,7 +2328,7 @@
                 <w:szCs w:val="24"/>
                 <w:color w:val="000000"/>
               </w:rPr>
-              <w:t xml:space="preserve">-13.34% (-25.11% to 0.28%)</w:t>
+              <w:t xml:space="preserve">0.4% (0.3% to 0.51%)</w:t>
             </w:r>
           </w:p>
         </w:tc>
@@ -2383,7 +2383,7 @@
                 <w:szCs w:val="24"/>
                 <w:color w:val="000000"/>
               </w:rPr>
-              <w:t xml:space="preserve">0.163</w:t>
+              <w:t xml:space="preserve">&lt;0.001</w:t>
             </w:r>
           </w:p>
         </w:tc>
@@ -2608,7 +2608,7 @@
                 <w:szCs w:val="24"/>
                 <w:color w:val="000000"/>
               </w:rPr>
-              <w:t xml:space="preserve">1231.7 (927.41 to 1536)</w:t>
+              <w:t xml:space="preserve">33.047 (-160.55 to 226.64)</w:t>
             </w:r>
           </w:p>
         </w:tc>
@@ -2718,7 +2718,7 @@
                 <w:szCs w:val="24"/>
                 <w:color w:val="000000"/>
               </w:rPr>
-              <w:t xml:space="preserve"/>
+              <w:t xml:space="preserve">1</w:t>
             </w:r>
           </w:p>
         </w:tc>
@@ -2730,7 +2730,7 @@
         <w:tc>
           <w:tcPr>
             <w:tcBorders>
-              <w:bottom w:val="none" w:sz="0" w:space="0" w:color="000000"/>
+              <w:bottom w:val="single" w:sz="12" w:space="0" w:color="666666"/>
               <w:top w:val="single" w:sz="12" w:space="0" w:color="666666"/>
               <w:left w:val="none" w:sz="0" w:space="0" w:color="000000"/>
               <w:right w:val="none" w:sz="0" w:space="0" w:color="000000"/>
@@ -2785,7 +2785,7 @@
         <w:tc>
           <w:tcPr>
             <w:tcBorders>
-              <w:bottom w:val="none" w:sz="0" w:space="0" w:color="000000"/>
+              <w:bottom w:val="single" w:sz="12" w:space="0" w:color="666666"/>
               <w:top w:val="single" w:sz="12" w:space="0" w:color="666666"/>
               <w:left w:val="none" w:sz="0" w:space="0" w:color="000000"/>
               <w:right w:val="none" w:sz="0" w:space="0" w:color="000000"/>
@@ -2840,7 +2840,7 @@
         <w:tc>
           <w:tcPr>
             <w:tcBorders>
-              <w:bottom w:val="none" w:sz="0" w:space="0" w:color="000000"/>
+              <w:bottom w:val="single" w:sz="12" w:space="0" w:color="666666"/>
               <w:top w:val="single" w:sz="12" w:space="0" w:color="666666"/>
               <w:left w:val="none" w:sz="0" w:space="0" w:color="000000"/>
               <w:right w:val="none" w:sz="0" w:space="0" w:color="000000"/>
@@ -2888,14 +2888,14 @@
                 <w:szCs w:val="24"/>
                 <w:color w:val="000000"/>
               </w:rPr>
-              <w:t xml:space="preserve">2020-02-01 (2019-12-01 to 2020-03-01)</w:t>
-            </w:r>
-          </w:p>
-        </w:tc>
-        <w:tc>
-          <w:tcPr>
-            <w:tcBorders>
-              <w:bottom w:val="none" w:sz="0" w:space="0" w:color="000000"/>
+              <w:t xml:space="preserve">2021-10-01 (2021-07-01 to 2022-01-01)</w:t>
+            </w:r>
+          </w:p>
+        </w:tc>
+        <w:tc>
+          <w:tcPr>
+            <w:tcBorders>
+              <w:bottom w:val="single" w:sz="12" w:space="0" w:color="666666"/>
               <w:top w:val="single" w:sz="12" w:space="0" w:color="666666"/>
               <w:left w:val="none" w:sz="0" w:space="0" w:color="000000"/>
               <w:right w:val="none" w:sz="0" w:space="0" w:color="000000"/>
@@ -2943,14 +2943,14 @@
                 <w:szCs w:val="24"/>
                 <w:color w:val="000000"/>
               </w:rPr>
-              <w:t xml:space="preserve">-16946 (-24443 to -9448.7)</w:t>
-            </w:r>
-          </w:p>
-        </w:tc>
-        <w:tc>
-          <w:tcPr>
-            <w:tcBorders>
-              <w:bottom w:val="none" w:sz="0" w:space="0" w:color="000000"/>
+              <w:t xml:space="preserve">2880.5 (2750.3 to 3010.6)</w:t>
+            </w:r>
+          </w:p>
+        </w:tc>
+        <w:tc>
+          <w:tcPr>
+            <w:tcBorders>
+              <w:bottom w:val="single" w:sz="12" w:space="0" w:color="666666"/>
               <w:top w:val="single" w:sz="12" w:space="0" w:color="666666"/>
               <w:left w:val="none" w:sz="0" w:space="0" w:color="000000"/>
               <w:right w:val="none" w:sz="0" w:space="0" w:color="000000"/>
@@ -2998,685 +2998,15 @@
                 <w:szCs w:val="24"/>
                 <w:color w:val="000000"/>
               </w:rPr>
-              <w:t xml:space="preserve">-18177.59 (-25661.99 to -10693.2)</w:t>
-            </w:r>
-          </w:p>
-        </w:tc>
-        <w:tc>
-          <w:tcPr>
-            <w:tcBorders>
-              <w:bottom w:val="none" w:sz="0" w:space="0" w:color="000000"/>
+              <w:t xml:space="preserve">2847.43 (2640.52 to 3054.33)</w:t>
+            </w:r>
+          </w:p>
+        </w:tc>
+        <w:tc>
+          <w:tcPr>
+            <w:tcBorders>
+              <w:bottom w:val="single" w:sz="12" w:space="0" w:color="666666"/>
               <w:top w:val="single" w:sz="12" w:space="0" w:color="666666"/>
-              <w:left w:val="none" w:sz="0" w:space="0" w:color="000000"/>
-              <w:right w:val="none" w:sz="0" w:space="0" w:color="000000"/>
-            </w:tcBorders>
-            <w:shd w:val="clear" w:color="auto" w:fill="FFFFFF"/>
-            <w:tcMar>
-              <w:top w:w="0" w:type="dxa"/>
-              <w:bottom w:w="0" w:type="dxa"/>
-              <w:left w:w="0" w:type="dxa"/>
-              <w:right w:w="0" w:type="dxa"/>
-            </w:tcMar>
-            <w:vAlign w:val="center"/>
-          </w:tcPr>
-          <w:p>
-            <w:pPr>
-              <w:pStyle w:val="Normal"/>
-              <w:jc w:val="left"/>
-              <w:pBdr>
-                <w:bottom w:val="none" w:sz="0" w:space="0" w:color="000000"/>
-                <w:top w:val="none" w:sz="0" w:space="0" w:color="000000"/>
-                <w:left w:val="none" w:sz="0" w:space="0" w:color="000000"/>
-                <w:right w:val="none" w:sz="0" w:space="0" w:color="000000"/>
-              </w:pBdr>
-              <w:spacing w:after="100" w:before="100" w:line="240"/>
-              <w:ind w:left="100" w:right="100" w:firstLine="0" w:firstLineChars="0"/>
-              <w:rPr>
-                <w:rFonts w:ascii="Times New Roman" w:hAnsi="Arial" w:eastAsia="Arial" w:cs="Arial"/>
-                <w:i w:val="false"/>
-                <w:b w:val="false"/>
-                <w:u w:val="none"/>
-                <w:strike w:val="false"/>
-                <w:sz w:val="24"/>
-                <w:szCs w:val="24"/>
-                <w:color w:val="000000"/>
-              </w:rPr>
-            </w:pPr>
-            <w:r>
-              <w:rPr>
-                <w:rFonts w:ascii="Times New Roman" w:hAnsi="Arial" w:eastAsia="Arial" w:cs="Arial"/>
-                <w:i w:val="false"/>
-                <w:b w:val="false"/>
-                <w:u w:val="none"/>
-                <w:strike w:val="false"/>
-                <w:sz w:val="24"/>
-                <w:szCs w:val="24"/>
-                <w:color w:val="000000"/>
-              </w:rPr>
-              <w:t xml:space="preserve">&lt;0.001</w:t>
-            </w:r>
-          </w:p>
-        </w:tc>
-      </w:tr>
-      <w:tr>
-        <w:trPr>
-          <w:trHeight w:val="360" w:hRule="auto"/>
-        </w:trPr>
-        <w:tc>
-          <w:tcPr>
-            <w:tcBorders>
-              <w:bottom w:val="none" w:sz="0" w:space="0" w:color="000000"/>
-              <w:top w:val="none" w:sz="0" w:space="0" w:color="000000"/>
-              <w:left w:val="none" w:sz="0" w:space="0" w:color="000000"/>
-              <w:right w:val="none" w:sz="0" w:space="0" w:color="000000"/>
-            </w:tcBorders>
-            <w:shd w:val="clear" w:color="auto" w:fill="FFFFFF"/>
-            <w:tcMar>
-              <w:top w:w="0" w:type="dxa"/>
-              <w:bottom w:w="0" w:type="dxa"/>
-              <w:left w:w="0" w:type="dxa"/>
-              <w:right w:w="0" w:type="dxa"/>
-            </w:tcMar>
-            <w:vAlign w:val="center"/>
-          </w:tcPr>
-          <w:p>
-            <w:pPr>
-              <w:pStyle w:val="Normal"/>
-              <w:jc w:val="left"/>
-              <w:pBdr>
-                <w:bottom w:val="none" w:sz="0" w:space="0" w:color="000000"/>
-                <w:top w:val="none" w:sz="0" w:space="0" w:color="000000"/>
-                <w:left w:val="none" w:sz="0" w:space="0" w:color="000000"/>
-                <w:right w:val="none" w:sz="0" w:space="0" w:color="000000"/>
-              </w:pBdr>
-              <w:spacing w:after="100" w:before="100" w:line="240"/>
-              <w:ind w:left="100" w:right="100" w:firstLine="0" w:firstLineChars="0"/>
-              <w:rPr>
-                <w:rFonts w:ascii="Times New Roman" w:hAnsi="Arial" w:eastAsia="Arial" w:cs="Arial"/>
-                <w:i w:val="false"/>
-                <w:b w:val="false"/>
-                <w:u w:val="none"/>
-                <w:strike w:val="false"/>
-                <w:sz w:val="24"/>
-                <w:szCs w:val="24"/>
-                <w:color w:val="000000"/>
-              </w:rPr>
-            </w:pPr>
-            <w:r>
-              <w:rPr>
-                <w:rFonts w:ascii="Times New Roman" w:hAnsi="Arial" w:eastAsia="Arial" w:cs="Arial"/>
-                <w:i w:val="false"/>
-                <w:b w:val="false"/>
-                <w:u w:val="none"/>
-                <w:strike w:val="false"/>
-                <w:sz w:val="24"/>
-                <w:szCs w:val="24"/>
-                <w:color w:val="000000"/>
-              </w:rPr>
-              <w:t xml:space="preserve">SCMD</w:t>
-            </w:r>
-          </w:p>
-        </w:tc>
-        <w:tc>
-          <w:tcPr>
-            <w:tcBorders>
-              <w:bottom w:val="none" w:sz="0" w:space="0" w:color="000000"/>
-              <w:top w:val="none" w:sz="0" w:space="0" w:color="000000"/>
-              <w:left w:val="none" w:sz="0" w:space="0" w:color="000000"/>
-              <w:right w:val="none" w:sz="0" w:space="0" w:color="000000"/>
-            </w:tcBorders>
-            <w:shd w:val="clear" w:color="auto" w:fill="FFFFFF"/>
-            <w:tcMar>
-              <w:top w:w="0" w:type="dxa"/>
-              <w:bottom w:w="0" w:type="dxa"/>
-              <w:left w:w="0" w:type="dxa"/>
-              <w:right w:w="0" w:type="dxa"/>
-            </w:tcMar>
-            <w:vAlign w:val="center"/>
-          </w:tcPr>
-          <w:p>
-            <w:pPr>
-              <w:pStyle w:val="Normal"/>
-              <w:jc w:val="left"/>
-              <w:pBdr>
-                <w:bottom w:val="none" w:sz="0" w:space="0" w:color="000000"/>
-                <w:top w:val="none" w:sz="0" w:space="0" w:color="000000"/>
-                <w:left w:val="none" w:sz="0" w:space="0" w:color="000000"/>
-                <w:right w:val="none" w:sz="0" w:space="0" w:color="000000"/>
-              </w:pBdr>
-              <w:spacing w:after="100" w:before="100" w:line="240"/>
-              <w:ind w:left="100" w:right="100" w:firstLine="0" w:firstLineChars="0"/>
-              <w:rPr>
-                <w:rFonts w:ascii="Times New Roman" w:hAnsi="Arial" w:eastAsia="Arial" w:cs="Arial"/>
-                <w:i w:val="false"/>
-                <w:b w:val="false"/>
-                <w:u w:val="none"/>
-                <w:strike w:val="false"/>
-                <w:sz w:val="24"/>
-                <w:szCs w:val="24"/>
-                <w:color w:val="000000"/>
-              </w:rPr>
-            </w:pPr>
-            <w:r>
-              <w:rPr>
-                <w:rFonts w:ascii="Times New Roman" w:hAnsi="Arial" w:eastAsia="Arial" w:cs="Arial"/>
-                <w:i w:val="false"/>
-                <w:b w:val="false"/>
-                <w:u w:val="none"/>
-                <w:strike w:val="false"/>
-                <w:sz w:val="24"/>
-                <w:szCs w:val="24"/>
-                <w:color w:val="000000"/>
-              </w:rPr>
-              <w:t xml:space="preserve">2</w:t>
-            </w:r>
-          </w:p>
-        </w:tc>
-        <w:tc>
-          <w:tcPr>
-            <w:tcBorders>
-              <w:bottom w:val="none" w:sz="0" w:space="0" w:color="000000"/>
-              <w:top w:val="none" w:sz="0" w:space="0" w:color="000000"/>
-              <w:left w:val="none" w:sz="0" w:space="0" w:color="000000"/>
-              <w:right w:val="none" w:sz="0" w:space="0" w:color="000000"/>
-            </w:tcBorders>
-            <w:shd w:val="clear" w:color="auto" w:fill="FFFFFF"/>
-            <w:tcMar>
-              <w:top w:w="0" w:type="dxa"/>
-              <w:bottom w:w="0" w:type="dxa"/>
-              <w:left w:w="0" w:type="dxa"/>
-              <w:right w:w="0" w:type="dxa"/>
-            </w:tcMar>
-            <w:vAlign w:val="center"/>
-          </w:tcPr>
-          <w:p>
-            <w:pPr>
-              <w:pStyle w:val="Normal"/>
-              <w:jc w:val="left"/>
-              <w:pBdr>
-                <w:bottom w:val="none" w:sz="0" w:space="0" w:color="000000"/>
-                <w:top w:val="none" w:sz="0" w:space="0" w:color="000000"/>
-                <w:left w:val="none" w:sz="0" w:space="0" w:color="000000"/>
-                <w:right w:val="none" w:sz="0" w:space="0" w:color="000000"/>
-              </w:pBdr>
-              <w:spacing w:after="100" w:before="100" w:line="240"/>
-              <w:ind w:left="100" w:right="100" w:firstLine="0" w:firstLineChars="0"/>
-              <w:rPr>
-                <w:rFonts w:ascii="Times New Roman" w:hAnsi="Arial" w:eastAsia="Arial" w:cs="Arial"/>
-                <w:i w:val="false"/>
-                <w:b w:val="false"/>
-                <w:u w:val="none"/>
-                <w:strike w:val="false"/>
-                <w:sz w:val="24"/>
-                <w:szCs w:val="24"/>
-                <w:color w:val="000000"/>
-              </w:rPr>
-            </w:pPr>
-            <w:r>
-              <w:rPr>
-                <w:rFonts w:ascii="Times New Roman" w:hAnsi="Arial" w:eastAsia="Arial" w:cs="Arial"/>
-                <w:i w:val="false"/>
-                <w:b w:val="false"/>
-                <w:u w:val="none"/>
-                <w:strike w:val="false"/>
-                <w:sz w:val="24"/>
-                <w:szCs w:val="24"/>
-                <w:color w:val="000000"/>
-              </w:rPr>
-              <w:t xml:space="preserve">2020-05-01 (2020-03-01 to 2020-06-01)</w:t>
-            </w:r>
-          </w:p>
-        </w:tc>
-        <w:tc>
-          <w:tcPr>
-            <w:tcBorders>
-              <w:bottom w:val="none" w:sz="0" w:space="0" w:color="000000"/>
-              <w:top w:val="none" w:sz="0" w:space="0" w:color="000000"/>
-              <w:left w:val="none" w:sz="0" w:space="0" w:color="000000"/>
-              <w:right w:val="none" w:sz="0" w:space="0" w:color="000000"/>
-            </w:tcBorders>
-            <w:shd w:val="clear" w:color="auto" w:fill="FFFFFF"/>
-            <w:tcMar>
-              <w:top w:w="0" w:type="dxa"/>
-              <w:bottom w:w="0" w:type="dxa"/>
-              <w:left w:w="0" w:type="dxa"/>
-              <w:right w:w="0" w:type="dxa"/>
-            </w:tcMar>
-            <w:vAlign w:val="center"/>
-          </w:tcPr>
-          <w:p>
-            <w:pPr>
-              <w:pStyle w:val="Normal"/>
-              <w:jc w:val="left"/>
-              <w:pBdr>
-                <w:bottom w:val="none" w:sz="0" w:space="0" w:color="000000"/>
-                <w:top w:val="none" w:sz="0" w:space="0" w:color="000000"/>
-                <w:left w:val="none" w:sz="0" w:space="0" w:color="000000"/>
-                <w:right w:val="none" w:sz="0" w:space="0" w:color="000000"/>
-              </w:pBdr>
-              <w:spacing w:after="100" w:before="100" w:line="240"/>
-              <w:ind w:left="100" w:right="100" w:firstLine="0" w:firstLineChars="0"/>
-              <w:rPr>
-                <w:rFonts w:ascii="Times New Roman" w:hAnsi="Arial" w:eastAsia="Arial" w:cs="Arial"/>
-                <w:i w:val="false"/>
-                <w:b w:val="false"/>
-                <w:u w:val="none"/>
-                <w:strike w:val="false"/>
-                <w:sz w:val="24"/>
-                <w:szCs w:val="24"/>
-                <w:color w:val="000000"/>
-              </w:rPr>
-            </w:pPr>
-            <w:r>
-              <w:rPr>
-                <w:rFonts w:ascii="Times New Roman" w:hAnsi="Arial" w:eastAsia="Arial" w:cs="Arial"/>
-                <w:i w:val="false"/>
-                <w:b w:val="false"/>
-                <w:u w:val="none"/>
-                <w:strike w:val="false"/>
-                <w:sz w:val="24"/>
-                <w:szCs w:val="24"/>
-                <w:color w:val="000000"/>
-              </w:rPr>
-              <w:t xml:space="preserve">2558.9 (2376.3 to 2741.6)</w:t>
-            </w:r>
-          </w:p>
-        </w:tc>
-        <w:tc>
-          <w:tcPr>
-            <w:tcBorders>
-              <w:bottom w:val="none" w:sz="0" w:space="0" w:color="000000"/>
-              <w:top w:val="none" w:sz="0" w:space="0" w:color="000000"/>
-              <w:left w:val="none" w:sz="0" w:space="0" w:color="000000"/>
-              <w:right w:val="none" w:sz="0" w:space="0" w:color="000000"/>
-            </w:tcBorders>
-            <w:shd w:val="clear" w:color="auto" w:fill="FFFFFF"/>
-            <w:tcMar>
-              <w:top w:w="0" w:type="dxa"/>
-              <w:bottom w:w="0" w:type="dxa"/>
-              <w:left w:w="0" w:type="dxa"/>
-              <w:right w:w="0" w:type="dxa"/>
-            </w:tcMar>
-            <w:vAlign w:val="center"/>
-          </w:tcPr>
-          <w:p>
-            <w:pPr>
-              <w:pStyle w:val="Normal"/>
-              <w:jc w:val="left"/>
-              <w:pBdr>
-                <w:bottom w:val="none" w:sz="0" w:space="0" w:color="000000"/>
-                <w:top w:val="none" w:sz="0" w:space="0" w:color="000000"/>
-                <w:left w:val="none" w:sz="0" w:space="0" w:color="000000"/>
-                <w:right w:val="none" w:sz="0" w:space="0" w:color="000000"/>
-              </w:pBdr>
-              <w:spacing w:after="100" w:before="100" w:line="240"/>
-              <w:ind w:left="100" w:right="100" w:firstLine="0" w:firstLineChars="0"/>
-              <w:rPr>
-                <w:rFonts w:ascii="Times New Roman" w:hAnsi="Arial" w:eastAsia="Arial" w:cs="Arial"/>
-                <w:i w:val="false"/>
-                <w:b w:val="false"/>
-                <w:u w:val="none"/>
-                <w:strike w:val="false"/>
-                <w:sz w:val="24"/>
-                <w:szCs w:val="24"/>
-                <w:color w:val="000000"/>
-              </w:rPr>
-            </w:pPr>
-            <w:r>
-              <w:rPr>
-                <w:rFonts w:ascii="Times New Roman" w:hAnsi="Arial" w:eastAsia="Arial" w:cs="Arial"/>
-                <w:i w:val="false"/>
-                <w:b w:val="false"/>
-                <w:u w:val="none"/>
-                <w:strike w:val="false"/>
-                <w:sz w:val="24"/>
-                <w:szCs w:val="24"/>
-                <w:color w:val="000000"/>
-              </w:rPr>
-              <w:t xml:space="preserve">19504.83 (12048.74 to 26960.93)</w:t>
-            </w:r>
-          </w:p>
-        </w:tc>
-        <w:tc>
-          <w:tcPr>
-            <w:tcBorders>
-              <w:bottom w:val="none" w:sz="0" w:space="0" w:color="000000"/>
-              <w:top w:val="none" w:sz="0" w:space="0" w:color="000000"/>
-              <w:left w:val="none" w:sz="0" w:space="0" w:color="000000"/>
-              <w:right w:val="none" w:sz="0" w:space="0" w:color="000000"/>
-            </w:tcBorders>
-            <w:shd w:val="clear" w:color="auto" w:fill="FFFFFF"/>
-            <w:tcMar>
-              <w:top w:w="0" w:type="dxa"/>
-              <w:bottom w:w="0" w:type="dxa"/>
-              <w:left w:w="0" w:type="dxa"/>
-              <w:right w:w="0" w:type="dxa"/>
-            </w:tcMar>
-            <w:vAlign w:val="center"/>
-          </w:tcPr>
-          <w:p>
-            <w:pPr>
-              <w:pStyle w:val="Normal"/>
-              <w:jc w:val="left"/>
-              <w:pBdr>
-                <w:bottom w:val="none" w:sz="0" w:space="0" w:color="000000"/>
-                <w:top w:val="none" w:sz="0" w:space="0" w:color="000000"/>
-                <w:left w:val="none" w:sz="0" w:space="0" w:color="000000"/>
-                <w:right w:val="none" w:sz="0" w:space="0" w:color="000000"/>
-              </w:pBdr>
-              <w:spacing w:after="100" w:before="100" w:line="240"/>
-              <w:ind w:left="100" w:right="100" w:firstLine="0" w:firstLineChars="0"/>
-              <w:rPr>
-                <w:rFonts w:ascii="Times New Roman" w:hAnsi="Arial" w:eastAsia="Arial" w:cs="Arial"/>
-                <w:i w:val="false"/>
-                <w:b w:val="false"/>
-                <w:u w:val="none"/>
-                <w:strike w:val="false"/>
-                <w:sz w:val="24"/>
-                <w:szCs w:val="24"/>
-                <w:color w:val="000000"/>
-              </w:rPr>
-            </w:pPr>
-            <w:r>
-              <w:rPr>
-                <w:rFonts w:ascii="Times New Roman" w:hAnsi="Arial" w:eastAsia="Arial" w:cs="Arial"/>
-                <w:i w:val="false"/>
-                <w:b w:val="false"/>
-                <w:u w:val="none"/>
-                <w:strike w:val="false"/>
-                <w:sz w:val="24"/>
-                <w:szCs w:val="24"/>
-                <w:color w:val="000000"/>
-              </w:rPr>
-              <w:t xml:space="preserve">&lt;0.001</w:t>
-            </w:r>
-          </w:p>
-        </w:tc>
-      </w:tr>
-      <w:tr>
-        <w:trPr>
-          <w:trHeight w:val="360" w:hRule="auto"/>
-        </w:trPr>
-        <w:tc>
-          <w:tcPr>
-            <w:tcBorders>
-              <w:bottom w:val="single" w:sz="12" w:space="0" w:color="666666"/>
-              <w:top w:val="none" w:sz="0" w:space="0" w:color="000000"/>
-              <w:left w:val="none" w:sz="0" w:space="0" w:color="000000"/>
-              <w:right w:val="none" w:sz="0" w:space="0" w:color="000000"/>
-            </w:tcBorders>
-            <w:shd w:val="clear" w:color="auto" w:fill="FFFFFF"/>
-            <w:tcMar>
-              <w:top w:w="0" w:type="dxa"/>
-              <w:bottom w:w="0" w:type="dxa"/>
-              <w:left w:w="0" w:type="dxa"/>
-              <w:right w:w="0" w:type="dxa"/>
-            </w:tcMar>
-            <w:vAlign w:val="center"/>
-          </w:tcPr>
-          <w:p>
-            <w:pPr>
-              <w:pStyle w:val="Normal"/>
-              <w:jc w:val="left"/>
-              <w:pBdr>
-                <w:bottom w:val="none" w:sz="0" w:space="0" w:color="000000"/>
-                <w:top w:val="none" w:sz="0" w:space="0" w:color="000000"/>
-                <w:left w:val="none" w:sz="0" w:space="0" w:color="000000"/>
-                <w:right w:val="none" w:sz="0" w:space="0" w:color="000000"/>
-              </w:pBdr>
-              <w:spacing w:after="100" w:before="100" w:line="240"/>
-              <w:ind w:left="100" w:right="100" w:firstLine="0" w:firstLineChars="0"/>
-              <w:rPr>
-                <w:rFonts w:ascii="Times New Roman" w:hAnsi="Arial" w:eastAsia="Arial" w:cs="Arial"/>
-                <w:i w:val="false"/>
-                <w:b w:val="false"/>
-                <w:u w:val="none"/>
-                <w:strike w:val="false"/>
-                <w:sz w:val="24"/>
-                <w:szCs w:val="24"/>
-                <w:color w:val="000000"/>
-              </w:rPr>
-            </w:pPr>
-            <w:r>
-              <w:rPr>
-                <w:rFonts w:ascii="Times New Roman" w:hAnsi="Arial" w:eastAsia="Arial" w:cs="Arial"/>
-                <w:i w:val="false"/>
-                <w:b w:val="false"/>
-                <w:u w:val="none"/>
-                <w:strike w:val="false"/>
-                <w:sz w:val="24"/>
-                <w:szCs w:val="24"/>
-                <w:color w:val="000000"/>
-              </w:rPr>
-              <w:t xml:space="preserve">SCMD</w:t>
-            </w:r>
-          </w:p>
-        </w:tc>
-        <w:tc>
-          <w:tcPr>
-            <w:tcBorders>
-              <w:bottom w:val="single" w:sz="12" w:space="0" w:color="666666"/>
-              <w:top w:val="none" w:sz="0" w:space="0" w:color="000000"/>
-              <w:left w:val="none" w:sz="0" w:space="0" w:color="000000"/>
-              <w:right w:val="none" w:sz="0" w:space="0" w:color="000000"/>
-            </w:tcBorders>
-            <w:shd w:val="clear" w:color="auto" w:fill="FFFFFF"/>
-            <w:tcMar>
-              <w:top w:w="0" w:type="dxa"/>
-              <w:bottom w:w="0" w:type="dxa"/>
-              <w:left w:w="0" w:type="dxa"/>
-              <w:right w:w="0" w:type="dxa"/>
-            </w:tcMar>
-            <w:vAlign w:val="center"/>
-          </w:tcPr>
-          <w:p>
-            <w:pPr>
-              <w:pStyle w:val="Normal"/>
-              <w:jc w:val="left"/>
-              <w:pBdr>
-                <w:bottom w:val="none" w:sz="0" w:space="0" w:color="000000"/>
-                <w:top w:val="none" w:sz="0" w:space="0" w:color="000000"/>
-                <w:left w:val="none" w:sz="0" w:space="0" w:color="000000"/>
-                <w:right w:val="none" w:sz="0" w:space="0" w:color="000000"/>
-              </w:pBdr>
-              <w:spacing w:after="100" w:before="100" w:line="240"/>
-              <w:ind w:left="100" w:right="100" w:firstLine="0" w:firstLineChars="0"/>
-              <w:rPr>
-                <w:rFonts w:ascii="Times New Roman" w:hAnsi="Arial" w:eastAsia="Arial" w:cs="Arial"/>
-                <w:i w:val="false"/>
-                <w:b w:val="false"/>
-                <w:u w:val="none"/>
-                <w:strike w:val="false"/>
-                <w:sz w:val="24"/>
-                <w:szCs w:val="24"/>
-                <w:color w:val="000000"/>
-              </w:rPr>
-            </w:pPr>
-            <w:r>
-              <w:rPr>
-                <w:rFonts w:ascii="Times New Roman" w:hAnsi="Arial" w:eastAsia="Arial" w:cs="Arial"/>
-                <w:i w:val="false"/>
-                <w:b w:val="false"/>
-                <w:u w:val="none"/>
-                <w:strike w:val="false"/>
-                <w:sz w:val="24"/>
-                <w:szCs w:val="24"/>
-                <w:color w:val="000000"/>
-              </w:rPr>
-              <w:t xml:space="preserve">3</w:t>
-            </w:r>
-          </w:p>
-        </w:tc>
-        <w:tc>
-          <w:tcPr>
-            <w:tcBorders>
-              <w:bottom w:val="single" w:sz="12" w:space="0" w:color="666666"/>
-              <w:top w:val="none" w:sz="0" w:space="0" w:color="000000"/>
-              <w:left w:val="none" w:sz="0" w:space="0" w:color="000000"/>
-              <w:right w:val="none" w:sz="0" w:space="0" w:color="000000"/>
-            </w:tcBorders>
-            <w:shd w:val="clear" w:color="auto" w:fill="FFFFFF"/>
-            <w:tcMar>
-              <w:top w:w="0" w:type="dxa"/>
-              <w:bottom w:w="0" w:type="dxa"/>
-              <w:left w:w="0" w:type="dxa"/>
-              <w:right w:w="0" w:type="dxa"/>
-            </w:tcMar>
-            <w:vAlign w:val="center"/>
-          </w:tcPr>
-          <w:p>
-            <w:pPr>
-              <w:pStyle w:val="Normal"/>
-              <w:jc w:val="left"/>
-              <w:pBdr>
-                <w:bottom w:val="none" w:sz="0" w:space="0" w:color="000000"/>
-                <w:top w:val="none" w:sz="0" w:space="0" w:color="000000"/>
-                <w:left w:val="none" w:sz="0" w:space="0" w:color="000000"/>
-                <w:right w:val="none" w:sz="0" w:space="0" w:color="000000"/>
-              </w:pBdr>
-              <w:spacing w:after="100" w:before="100" w:line="240"/>
-              <w:ind w:left="100" w:right="100" w:firstLine="0" w:firstLineChars="0"/>
-              <w:rPr>
-                <w:rFonts w:ascii="Times New Roman" w:hAnsi="Arial" w:eastAsia="Arial" w:cs="Arial"/>
-                <w:i w:val="false"/>
-                <w:b w:val="false"/>
-                <w:u w:val="none"/>
-                <w:strike w:val="false"/>
-                <w:sz w:val="24"/>
-                <w:szCs w:val="24"/>
-                <w:color w:val="000000"/>
-              </w:rPr>
-            </w:pPr>
-            <w:r>
-              <w:rPr>
-                <w:rFonts w:ascii="Times New Roman" w:hAnsi="Arial" w:eastAsia="Arial" w:cs="Arial"/>
-                <w:i w:val="false"/>
-                <w:b w:val="false"/>
-                <w:u w:val="none"/>
-                <w:strike w:val="false"/>
-                <w:sz w:val="24"/>
-                <w:szCs w:val="24"/>
-                <w:color w:val="000000"/>
-              </w:rPr>
-              <w:t xml:space="preserve">2024-12-01 (2024-10-01 to 2025-01-01)</w:t>
-            </w:r>
-          </w:p>
-        </w:tc>
-        <w:tc>
-          <w:tcPr>
-            <w:tcBorders>
-              <w:bottom w:val="single" w:sz="12" w:space="0" w:color="666666"/>
-              <w:top w:val="none" w:sz="0" w:space="0" w:color="000000"/>
-              <w:left w:val="none" w:sz="0" w:space="0" w:color="000000"/>
-              <w:right w:val="none" w:sz="0" w:space="0" w:color="000000"/>
-            </w:tcBorders>
-            <w:shd w:val="clear" w:color="auto" w:fill="FFFFFF"/>
-            <w:tcMar>
-              <w:top w:w="0" w:type="dxa"/>
-              <w:bottom w:w="0" w:type="dxa"/>
-              <w:left w:w="0" w:type="dxa"/>
-              <w:right w:w="0" w:type="dxa"/>
-            </w:tcMar>
-            <w:vAlign w:val="center"/>
-          </w:tcPr>
-          <w:p>
-            <w:pPr>
-              <w:pStyle w:val="Normal"/>
-              <w:jc w:val="left"/>
-              <w:pBdr>
-                <w:bottom w:val="none" w:sz="0" w:space="0" w:color="000000"/>
-                <w:top w:val="none" w:sz="0" w:space="0" w:color="000000"/>
-                <w:left w:val="none" w:sz="0" w:space="0" w:color="000000"/>
-                <w:right w:val="none" w:sz="0" w:space="0" w:color="000000"/>
-              </w:pBdr>
-              <w:spacing w:after="100" w:before="100" w:line="240"/>
-              <w:ind w:left="100" w:right="100" w:firstLine="0" w:firstLineChars="0"/>
-              <w:rPr>
-                <w:rFonts w:ascii="Times New Roman" w:hAnsi="Arial" w:eastAsia="Arial" w:cs="Arial"/>
-                <w:i w:val="false"/>
-                <w:b w:val="false"/>
-                <w:u w:val="none"/>
-                <w:strike w:val="false"/>
-                <w:sz w:val="24"/>
-                <w:szCs w:val="24"/>
-                <w:color w:val="000000"/>
-              </w:rPr>
-            </w:pPr>
-            <w:r>
-              <w:rPr>
-                <w:rFonts w:ascii="Times New Roman" w:hAnsi="Arial" w:eastAsia="Arial" w:cs="Arial"/>
-                <w:i w:val="false"/>
-                <w:b w:val="false"/>
-                <w:u w:val="none"/>
-                <w:strike w:val="false"/>
-                <w:sz w:val="24"/>
-                <w:szCs w:val="24"/>
-                <w:color w:val="000000"/>
-              </w:rPr>
-              <w:t xml:space="preserve">-4420.9 (-5828 to -3013.9)</w:t>
-            </w:r>
-          </w:p>
-        </w:tc>
-        <w:tc>
-          <w:tcPr>
-            <w:tcBorders>
-              <w:bottom w:val="single" w:sz="12" w:space="0" w:color="666666"/>
-              <w:top w:val="none" w:sz="0" w:space="0" w:color="000000"/>
-              <w:left w:val="none" w:sz="0" w:space="0" w:color="000000"/>
-              <w:right w:val="none" w:sz="0" w:space="0" w:color="000000"/>
-            </w:tcBorders>
-            <w:shd w:val="clear" w:color="auto" w:fill="FFFFFF"/>
-            <w:tcMar>
-              <w:top w:w="0" w:type="dxa"/>
-              <w:bottom w:w="0" w:type="dxa"/>
-              <w:left w:w="0" w:type="dxa"/>
-              <w:right w:w="0" w:type="dxa"/>
-            </w:tcMar>
-            <w:vAlign w:val="center"/>
-          </w:tcPr>
-          <w:p>
-            <w:pPr>
-              <w:pStyle w:val="Normal"/>
-              <w:jc w:val="left"/>
-              <w:pBdr>
-                <w:bottom w:val="none" w:sz="0" w:space="0" w:color="000000"/>
-                <w:top w:val="none" w:sz="0" w:space="0" w:color="000000"/>
-                <w:left w:val="none" w:sz="0" w:space="0" w:color="000000"/>
-                <w:right w:val="none" w:sz="0" w:space="0" w:color="000000"/>
-              </w:pBdr>
-              <w:spacing w:after="100" w:before="100" w:line="240"/>
-              <w:ind w:left="100" w:right="100" w:firstLine="0" w:firstLineChars="0"/>
-              <w:rPr>
-                <w:rFonts w:ascii="Times New Roman" w:hAnsi="Arial" w:eastAsia="Arial" w:cs="Arial"/>
-                <w:i w:val="false"/>
-                <w:b w:val="false"/>
-                <w:u w:val="none"/>
-                <w:strike w:val="false"/>
-                <w:sz w:val="24"/>
-                <w:szCs w:val="24"/>
-                <w:color w:val="000000"/>
-              </w:rPr>
-            </w:pPr>
-            <w:r>
-              <w:rPr>
-                <w:rFonts w:ascii="Times New Roman" w:hAnsi="Arial" w:eastAsia="Arial" w:cs="Arial"/>
-                <w:i w:val="false"/>
-                <w:b w:val="false"/>
-                <w:u w:val="none"/>
-                <w:strike w:val="false"/>
-                <w:sz w:val="24"/>
-                <w:szCs w:val="24"/>
-                <w:color w:val="000000"/>
-              </w:rPr>
-              <w:t xml:space="preserve">-6979.85 (-8435.68 to -5524.03)</w:t>
-            </w:r>
-          </w:p>
-        </w:tc>
-        <w:tc>
-          <w:tcPr>
-            <w:tcBorders>
-              <w:bottom w:val="single" w:sz="12" w:space="0" w:color="666666"/>
-              <w:top w:val="none" w:sz="0" w:space="0" w:color="000000"/>
               <w:left w:val="none" w:sz="0" w:space="0" w:color="000000"/>
               <w:right w:val="none" w:sz="0" w:space="0" w:color="000000"/>
             </w:tcBorders>

</xml_diff>

<commit_message>
Update change point fig and table
</commit_message>
<xml_diff>
--- a/output/tables/changepoint_table.docx
+++ b/output/tables/changepoint_table.docx
@@ -433,7 +433,7 @@
                 <w:szCs w:val="24"/>
                 <w:color w:val="000000"/>
               </w:rPr>
-              <w:t xml:space="preserve">FOI</w:t>
+              <w:t xml:space="preserve">GP</w:t>
             </w:r>
           </w:p>
         </w:tc>
@@ -598,7 +598,7 @@
                 <w:szCs w:val="24"/>
                 <w:color w:val="000000"/>
               </w:rPr>
-              <w:t xml:space="preserve">1.76% (1.41% to 2.11%)</w:t>
+              <w:t xml:space="preserve">0.54% (0.48% to 0.59%)</w:t>
             </w:r>
           </w:p>
         </w:tc>
@@ -768,7 +768,7 @@
                 <w:szCs w:val="24"/>
                 <w:color w:val="000000"/>
               </w:rPr>
-              <w:t xml:space="preserve">FOI</w:t>
+              <w:t xml:space="preserve">GP</w:t>
             </w:r>
           </w:p>
         </w:tc>
@@ -878,7 +878,7 @@
                 <w:szCs w:val="24"/>
                 <w:color w:val="000000"/>
               </w:rPr>
-              <w:t xml:space="preserve">2020-08-01 (2020-05-01 to 2020-10-01)</w:t>
+              <w:t xml:space="preserve">2018-04-01 (2017-04-01 to 2019-03-01)</w:t>
             </w:r>
           </w:p>
         </w:tc>
@@ -933,7 +933,7 @@
                 <w:szCs w:val="24"/>
                 <w:color w:val="000000"/>
               </w:rPr>
-              <w:t xml:space="preserve">20.38% (4.03% to 39.29%)</w:t>
+              <w:t xml:space="preserve">0.79% (0.7% to 0.89%)</w:t>
             </w:r>
           </w:p>
         </w:tc>
@@ -988,7 +988,7 @@
                 <w:szCs w:val="24"/>
                 <w:color w:val="000000"/>
               </w:rPr>
-              <w:t xml:space="preserve">18.3% (2.23% to 36.89%)</w:t>
+              <w:t xml:space="preserve">0.25% (0.15% to 0.36%)</w:t>
             </w:r>
           </w:p>
         </w:tc>
@@ -1043,7 +1043,7 @@
                 <w:szCs w:val="24"/>
                 <w:color w:val="000000"/>
               </w:rPr>
-              <w:t xml:space="preserve">0.098</w:t>
+              <w:t xml:space="preserve">&lt;0.001</w:t>
             </w:r>
           </w:p>
         </w:tc>
@@ -1103,7 +1103,7 @@
                 <w:szCs w:val="24"/>
                 <w:color w:val="000000"/>
               </w:rPr>
-              <w:t xml:space="preserve">FOI</w:t>
+              <w:t xml:space="preserve">GP</w:t>
             </w:r>
           </w:p>
         </w:tc>
@@ -1213,7 +1213,7 @@
                 <w:szCs w:val="24"/>
                 <w:color w:val="000000"/>
               </w:rPr>
-              <w:t xml:space="preserve">2020-12-01 (2020-09-01 to 2021-02-01)</w:t>
+              <w:t xml:space="preserve">2021-02-01 (2020-07-01 to 2021-08-01)</w:t>
             </w:r>
           </w:p>
         </w:tc>
@@ -1268,7 +1268,7 @@
                 <w:szCs w:val="24"/>
                 <w:color w:val="000000"/>
               </w:rPr>
-              <w:t xml:space="preserve">4.32% (3.91% to 4.73%)</w:t>
+              <w:t xml:space="preserve">1.2% (1.16% to 1.24%)</w:t>
             </w:r>
           </w:p>
         </w:tc>
@@ -1323,7 +1323,7 @@
                 <w:szCs w:val="24"/>
                 <w:color w:val="000000"/>
               </w:rPr>
-              <w:t xml:space="preserve">-13.34% (-25.11% to 0.28%)</w:t>
+              <w:t xml:space="preserve">0.4% (0.3% to 0.51%)</w:t>
             </w:r>
           </w:p>
         </w:tc>
@@ -1378,7 +1378,7 @@
                 <w:szCs w:val="24"/>
                 <w:color w:val="000000"/>
               </w:rPr>
-              <w:t xml:space="preserve">0.163</w:t>
+              <w:t xml:space="preserve">&lt;0.001</w:t>
             </w:r>
           </w:p>
         </w:tc>
@@ -1438,7 +1438,7 @@
                 <w:szCs w:val="24"/>
                 <w:color w:val="000000"/>
               </w:rPr>
-              <w:t xml:space="preserve">GP</w:t>
+              <w:t xml:space="preserve">FOI</w:t>
             </w:r>
           </w:p>
         </w:tc>
@@ -1603,7 +1603,7 @@
                 <w:szCs w:val="24"/>
                 <w:color w:val="000000"/>
               </w:rPr>
-              <w:t xml:space="preserve">0.54% (0.48% to 0.59%)</w:t>
+              <w:t xml:space="preserve">1.76% (1.41% to 2.11%)</w:t>
             </w:r>
           </w:p>
         </w:tc>
@@ -1713,7 +1713,7 @@
                 <w:szCs w:val="24"/>
                 <w:color w:val="000000"/>
               </w:rPr>
-              <w:t xml:space="preserve">&lt;0.001</w:t>
+              <w:t xml:space="preserve"/>
             </w:r>
           </w:p>
         </w:tc>
@@ -1773,7 +1773,7 @@
                 <w:szCs w:val="24"/>
                 <w:color w:val="000000"/>
               </w:rPr>
-              <w:t xml:space="preserve">GP</w:t>
+              <w:t xml:space="preserve">FOI</w:t>
             </w:r>
           </w:p>
         </w:tc>
@@ -1883,7 +1883,7 @@
                 <w:szCs w:val="24"/>
                 <w:color w:val="000000"/>
               </w:rPr>
-              <w:t xml:space="preserve">2018-04-01 (2017-04-01 to 2019-03-01)</w:t>
+              <w:t xml:space="preserve">2020-08-01 (2020-05-01 to 2020-10-01)</w:t>
             </w:r>
           </w:p>
         </w:tc>
@@ -1938,7 +1938,7 @@
                 <w:szCs w:val="24"/>
                 <w:color w:val="000000"/>
               </w:rPr>
-              <w:t xml:space="preserve">0.79% (0.7% to 0.89%)</w:t>
+              <w:t xml:space="preserve">20.38% (4.03% to 39.29%)</w:t>
             </w:r>
           </w:p>
         </w:tc>
@@ -1993,7 +1993,7 @@
                 <w:szCs w:val="24"/>
                 <w:color w:val="000000"/>
               </w:rPr>
-              <w:t xml:space="preserve">0.25% (0.15% to 0.36%)</w:t>
+              <w:t xml:space="preserve"/>
             </w:r>
           </w:p>
         </w:tc>
@@ -2048,7 +2048,7 @@
                 <w:szCs w:val="24"/>
                 <w:color w:val="000000"/>
               </w:rPr>
-              <w:t xml:space="preserve">&lt;0.001</w:t>
+              <w:t xml:space="preserve"/>
             </w:r>
           </w:p>
         </w:tc>
@@ -2108,7 +2108,7 @@
                 <w:szCs w:val="24"/>
                 <w:color w:val="000000"/>
               </w:rPr>
-              <w:t xml:space="preserve">GP</w:t>
+              <w:t xml:space="preserve">FOI</w:t>
             </w:r>
           </w:p>
         </w:tc>
@@ -2218,7 +2218,7 @@
                 <w:szCs w:val="24"/>
                 <w:color w:val="000000"/>
               </w:rPr>
-              <w:t xml:space="preserve">2021-02-01 (2020-07-01 to 2021-08-01)</w:t>
+              <w:t xml:space="preserve">2020-12-01 (2020-09-01 to 2021-02-01)</w:t>
             </w:r>
           </w:p>
         </w:tc>
@@ -2273,7 +2273,7 @@
                 <w:szCs w:val="24"/>
                 <w:color w:val="000000"/>
               </w:rPr>
-              <w:t xml:space="preserve">1.2% (1.16% to 1.24%)</w:t>
+              <w:t xml:space="preserve">4.32% (3.91% to 4.73%)</w:t>
             </w:r>
           </w:p>
         </w:tc>
@@ -2328,7 +2328,7 @@
                 <w:szCs w:val="24"/>
                 <w:color w:val="000000"/>
               </w:rPr>
-              <w:t xml:space="preserve">0.4% (0.3% to 0.51%)</w:t>
+              <w:t xml:space="preserve"/>
             </w:r>
           </w:p>
         </w:tc>
@@ -2383,7 +2383,7 @@
                 <w:szCs w:val="24"/>
                 <w:color w:val="000000"/>
               </w:rPr>
-              <w:t xml:space="preserve">&lt;0.001</w:t>
+              <w:t xml:space="preserve"/>
             </w:r>
           </w:p>
         </w:tc>

</xml_diff>

<commit_message>
Update results summary table
</commit_message>
<xml_diff>
--- a/output/tables/changepoint_table.docx
+++ b/output/tables/changepoint_table.docx
@@ -598,7 +598,7 @@
                 <w:szCs w:val="24"/>
                 <w:color w:val="000000"/>
               </w:rPr>
-              <w:t xml:space="preserve">0.54% (0.48% to 0.59%)</w:t>
+              <w:t xml:space="preserve">0.66% (0.58% to 0.73%)</w:t>
             </w:r>
           </w:p>
         </w:tc>
@@ -720,7 +720,7 @@
         <w:tc>
           <w:tcPr>
             <w:tcBorders>
-              <w:bottom w:val="none" w:sz="0" w:space="0" w:color="000000"/>
+              <w:bottom w:val="single" w:sz="12" w:space="0" w:color="666666"/>
               <w:top w:val="single" w:sz="12" w:space="0" w:color="666666"/>
               <w:left w:val="none" w:sz="0" w:space="0" w:color="000000"/>
               <w:right w:val="none" w:sz="0" w:space="0" w:color="000000"/>
@@ -775,7 +775,7 @@
         <w:tc>
           <w:tcPr>
             <w:tcBorders>
-              <w:bottom w:val="none" w:sz="0" w:space="0" w:color="000000"/>
+              <w:bottom w:val="single" w:sz="12" w:space="0" w:color="666666"/>
               <w:top w:val="single" w:sz="12" w:space="0" w:color="666666"/>
               <w:left w:val="none" w:sz="0" w:space="0" w:color="000000"/>
               <w:right w:val="none" w:sz="0" w:space="0" w:color="000000"/>
@@ -830,7 +830,7 @@
         <w:tc>
           <w:tcPr>
             <w:tcBorders>
-              <w:bottom w:val="none" w:sz="0" w:space="0" w:color="000000"/>
+              <w:bottom w:val="single" w:sz="12" w:space="0" w:color="666666"/>
               <w:top w:val="single" w:sz="12" w:space="0" w:color="666666"/>
               <w:left w:val="none" w:sz="0" w:space="0" w:color="000000"/>
               <w:right w:val="none" w:sz="0" w:space="0" w:color="000000"/>
@@ -878,14 +878,14 @@
                 <w:szCs w:val="24"/>
                 <w:color w:val="000000"/>
               </w:rPr>
-              <w:t xml:space="preserve">2018-04-01 (2017-04-01 to 2019-03-01)</w:t>
-            </w:r>
-          </w:p>
-        </w:tc>
-        <w:tc>
-          <w:tcPr>
-            <w:tcBorders>
-              <w:bottom w:val="none" w:sz="0" w:space="0" w:color="000000"/>
+              <w:t xml:space="preserve">2020-08-01 (2020-02-01 to 2021-01-01)</w:t>
+            </w:r>
+          </w:p>
+        </w:tc>
+        <w:tc>
+          <w:tcPr>
+            <w:tcBorders>
+              <w:bottom w:val="single" w:sz="12" w:space="0" w:color="666666"/>
               <w:top w:val="single" w:sz="12" w:space="0" w:color="666666"/>
               <w:left w:val="none" w:sz="0" w:space="0" w:color="000000"/>
               <w:right w:val="none" w:sz="0" w:space="0" w:color="000000"/>
@@ -933,14 +933,14 @@
                 <w:szCs w:val="24"/>
                 <w:color w:val="000000"/>
               </w:rPr>
-              <w:t xml:space="preserve">0.79% (0.7% to 0.89%)</w:t>
-            </w:r>
-          </w:p>
-        </w:tc>
-        <w:tc>
-          <w:tcPr>
-            <w:tcBorders>
-              <w:bottom w:val="none" w:sz="0" w:space="0" w:color="000000"/>
+              <w:t xml:space="preserve">1.19% (1.14% to 1.25%)</w:t>
+            </w:r>
+          </w:p>
+        </w:tc>
+        <w:tc>
+          <w:tcPr>
+            <w:tcBorders>
+              <w:bottom w:val="single" w:sz="12" w:space="0" w:color="666666"/>
               <w:top w:val="single" w:sz="12" w:space="0" w:color="666666"/>
               <w:left w:val="none" w:sz="0" w:space="0" w:color="000000"/>
               <w:right w:val="none" w:sz="0" w:space="0" w:color="000000"/>
@@ -988,14 +988,14 @@
                 <w:szCs w:val="24"/>
                 <w:color w:val="000000"/>
               </w:rPr>
-              <w:t xml:space="preserve">0.25% (0.15% to 0.36%)</w:t>
-            </w:r>
-          </w:p>
-        </w:tc>
-        <w:tc>
-          <w:tcPr>
-            <w:tcBorders>
-              <w:bottom w:val="none" w:sz="0" w:space="0" w:color="000000"/>
+              <w:t xml:space="preserve">0.54% (0.45% to 0.62%)</w:t>
+            </w:r>
+          </w:p>
+        </w:tc>
+        <w:tc>
+          <w:tcPr>
+            <w:tcBorders>
+              <w:bottom w:val="single" w:sz="12" w:space="0" w:color="666666"/>
               <w:top w:val="single" w:sz="12" w:space="0" w:color="666666"/>
               <w:left w:val="none" w:sz="0" w:space="0" w:color="000000"/>
               <w:right w:val="none" w:sz="0" w:space="0" w:color="000000"/>
@@ -1056,54 +1056,54 @@
           <w:tcPr>
             <w:tcBorders>
               <w:bottom w:val="single" w:sz="12" w:space="0" w:color="666666"/>
-              <w:top w:val="none" w:sz="0" w:space="0" w:color="000000"/>
-              <w:left w:val="none" w:sz="0" w:space="0" w:color="000000"/>
-              <w:right w:val="none" w:sz="0" w:space="0" w:color="000000"/>
-            </w:tcBorders>
-            <w:shd w:val="clear" w:color="auto" w:fill="FFFFFF"/>
-            <w:tcMar>
-              <w:top w:w="0" w:type="dxa"/>
-              <w:bottom w:w="0" w:type="dxa"/>
-              <w:left w:w="0" w:type="dxa"/>
-              <w:right w:w="0" w:type="dxa"/>
-            </w:tcMar>
-            <w:vAlign w:val="center"/>
-          </w:tcPr>
-          <w:p>
-            <w:pPr>
-              <w:pStyle w:val="Normal"/>
-              <w:jc w:val="left"/>
-              <w:pBdr>
-                <w:bottom w:val="none" w:sz="0" w:space="0" w:color="000000"/>
-                <w:top w:val="none" w:sz="0" w:space="0" w:color="000000"/>
-                <w:left w:val="none" w:sz="0" w:space="0" w:color="000000"/>
-                <w:right w:val="none" w:sz="0" w:space="0" w:color="000000"/>
-              </w:pBdr>
-              <w:spacing w:after="100" w:before="100" w:line="240"/>
-              <w:ind w:left="100" w:right="100" w:firstLine="0" w:firstLineChars="0"/>
-              <w:rPr>
-                <w:rFonts w:ascii="Times New Roman" w:hAnsi="Arial" w:eastAsia="Arial" w:cs="Arial"/>
-                <w:i w:val="false"/>
-                <w:b w:val="false"/>
-                <w:u w:val="none"/>
-                <w:strike w:val="false"/>
-                <w:sz w:val="24"/>
-                <w:szCs w:val="24"/>
-                <w:color w:val="000000"/>
-              </w:rPr>
-            </w:pPr>
-            <w:r>
-              <w:rPr>
-                <w:rFonts w:ascii="Times New Roman" w:hAnsi="Arial" w:eastAsia="Arial" w:cs="Arial"/>
-                <w:i w:val="false"/>
-                <w:b w:val="false"/>
-                <w:u w:val="none"/>
-                <w:strike w:val="false"/>
-                <w:sz w:val="24"/>
-                <w:szCs w:val="24"/>
-                <w:color w:val="000000"/>
-              </w:rPr>
-              <w:t xml:space="preserve">GP</w:t>
+              <w:top w:val="single" w:sz="12" w:space="0" w:color="666666"/>
+              <w:left w:val="none" w:sz="0" w:space="0" w:color="000000"/>
+              <w:right w:val="none" w:sz="0" w:space="0" w:color="000000"/>
+            </w:tcBorders>
+            <w:shd w:val="clear" w:color="auto" w:fill="FFFFFF"/>
+            <w:tcMar>
+              <w:top w:w="0" w:type="dxa"/>
+              <w:bottom w:w="0" w:type="dxa"/>
+              <w:left w:w="0" w:type="dxa"/>
+              <w:right w:w="0" w:type="dxa"/>
+            </w:tcMar>
+            <w:vAlign w:val="center"/>
+          </w:tcPr>
+          <w:p>
+            <w:pPr>
+              <w:pStyle w:val="Normal"/>
+              <w:jc w:val="left"/>
+              <w:pBdr>
+                <w:bottom w:val="none" w:sz="0" w:space="0" w:color="000000"/>
+                <w:top w:val="none" w:sz="0" w:space="0" w:color="000000"/>
+                <w:left w:val="none" w:sz="0" w:space="0" w:color="000000"/>
+                <w:right w:val="none" w:sz="0" w:space="0" w:color="000000"/>
+              </w:pBdr>
+              <w:spacing w:after="100" w:before="100" w:line="240"/>
+              <w:ind w:left="100" w:right="100" w:firstLine="0" w:firstLineChars="0"/>
+              <w:rPr>
+                <w:rFonts w:ascii="Times New Roman" w:hAnsi="Arial" w:eastAsia="Arial" w:cs="Arial"/>
+                <w:i w:val="false"/>
+                <w:b w:val="true"/>
+                <w:u w:val="none"/>
+                <w:strike w:val="false"/>
+                <w:sz w:val="24"/>
+                <w:szCs w:val="24"/>
+                <w:color w:val="000000"/>
+              </w:rPr>
+            </w:pPr>
+            <w:r>
+              <w:rPr>
+                <w:rFonts w:ascii="Times New Roman" w:hAnsi="Arial" w:eastAsia="Arial" w:cs="Arial"/>
+                <w:i w:val="false"/>
+                <w:b w:val="true"/>
+                <w:u w:val="none"/>
+                <w:strike w:val="false"/>
+                <w:sz w:val="24"/>
+                <w:szCs w:val="24"/>
+                <w:color w:val="000000"/>
+              </w:rPr>
+              <w:t xml:space="preserve">FOI</w:t>
             </w:r>
           </w:p>
         </w:tc>
@@ -1111,54 +1111,54 @@
           <w:tcPr>
             <w:tcBorders>
               <w:bottom w:val="single" w:sz="12" w:space="0" w:color="666666"/>
-              <w:top w:val="none" w:sz="0" w:space="0" w:color="000000"/>
-              <w:left w:val="none" w:sz="0" w:space="0" w:color="000000"/>
-              <w:right w:val="none" w:sz="0" w:space="0" w:color="000000"/>
-            </w:tcBorders>
-            <w:shd w:val="clear" w:color="auto" w:fill="FFFFFF"/>
-            <w:tcMar>
-              <w:top w:w="0" w:type="dxa"/>
-              <w:bottom w:w="0" w:type="dxa"/>
-              <w:left w:w="0" w:type="dxa"/>
-              <w:right w:w="0" w:type="dxa"/>
-            </w:tcMar>
-            <w:vAlign w:val="center"/>
-          </w:tcPr>
-          <w:p>
-            <w:pPr>
-              <w:pStyle w:val="Normal"/>
-              <w:jc w:val="left"/>
-              <w:pBdr>
-                <w:bottom w:val="none" w:sz="0" w:space="0" w:color="000000"/>
-                <w:top w:val="none" w:sz="0" w:space="0" w:color="000000"/>
-                <w:left w:val="none" w:sz="0" w:space="0" w:color="000000"/>
-                <w:right w:val="none" w:sz="0" w:space="0" w:color="000000"/>
-              </w:pBdr>
-              <w:spacing w:after="100" w:before="100" w:line="240"/>
-              <w:ind w:left="100" w:right="100" w:firstLine="0" w:firstLineChars="0"/>
-              <w:rPr>
-                <w:rFonts w:ascii="Times New Roman" w:hAnsi="Arial" w:eastAsia="Arial" w:cs="Arial"/>
-                <w:i w:val="false"/>
-                <w:b w:val="false"/>
-                <w:u w:val="none"/>
-                <w:strike w:val="false"/>
-                <w:sz w:val="24"/>
-                <w:szCs w:val="24"/>
-                <w:color w:val="000000"/>
-              </w:rPr>
-            </w:pPr>
-            <w:r>
-              <w:rPr>
-                <w:rFonts w:ascii="Times New Roman" w:hAnsi="Arial" w:eastAsia="Arial" w:cs="Arial"/>
-                <w:i w:val="false"/>
-                <w:b w:val="false"/>
-                <w:u w:val="none"/>
-                <w:strike w:val="false"/>
-                <w:sz w:val="24"/>
-                <w:szCs w:val="24"/>
-                <w:color w:val="000000"/>
-              </w:rPr>
-              <w:t xml:space="preserve">2</w:t>
+              <w:top w:val="single" w:sz="12" w:space="0" w:color="666666"/>
+              <w:left w:val="none" w:sz="0" w:space="0" w:color="000000"/>
+              <w:right w:val="none" w:sz="0" w:space="0" w:color="000000"/>
+            </w:tcBorders>
+            <w:shd w:val="clear" w:color="auto" w:fill="FFFFFF"/>
+            <w:tcMar>
+              <w:top w:w="0" w:type="dxa"/>
+              <w:bottom w:w="0" w:type="dxa"/>
+              <w:left w:w="0" w:type="dxa"/>
+              <w:right w:w="0" w:type="dxa"/>
+            </w:tcMar>
+            <w:vAlign w:val="center"/>
+          </w:tcPr>
+          <w:p>
+            <w:pPr>
+              <w:pStyle w:val="Normal"/>
+              <w:jc w:val="left"/>
+              <w:pBdr>
+                <w:bottom w:val="none" w:sz="0" w:space="0" w:color="000000"/>
+                <w:top w:val="none" w:sz="0" w:space="0" w:color="000000"/>
+                <w:left w:val="none" w:sz="0" w:space="0" w:color="000000"/>
+                <w:right w:val="none" w:sz="0" w:space="0" w:color="000000"/>
+              </w:pBdr>
+              <w:spacing w:after="100" w:before="100" w:line="240"/>
+              <w:ind w:left="100" w:right="100" w:firstLine="0" w:firstLineChars="0"/>
+              <w:rPr>
+                <w:rFonts w:ascii="Times New Roman" w:hAnsi="Arial" w:eastAsia="Arial" w:cs="Arial"/>
+                <w:i w:val="false"/>
+                <w:b w:val="true"/>
+                <w:u w:val="none"/>
+                <w:strike w:val="false"/>
+                <w:sz w:val="24"/>
+                <w:szCs w:val="24"/>
+                <w:color w:val="000000"/>
+              </w:rPr>
+            </w:pPr>
+            <w:r>
+              <w:rPr>
+                <w:rFonts w:ascii="Times New Roman" w:hAnsi="Arial" w:eastAsia="Arial" w:cs="Arial"/>
+                <w:i w:val="false"/>
+                <w:b w:val="true"/>
+                <w:u w:val="none"/>
+                <w:strike w:val="false"/>
+                <w:sz w:val="24"/>
+                <w:szCs w:val="24"/>
+                <w:color w:val="000000"/>
+              </w:rPr>
+              <w:t xml:space="preserve">0</w:t>
             </w:r>
           </w:p>
         </w:tc>
@@ -1166,54 +1166,54 @@
           <w:tcPr>
             <w:tcBorders>
               <w:bottom w:val="single" w:sz="12" w:space="0" w:color="666666"/>
-              <w:top w:val="none" w:sz="0" w:space="0" w:color="000000"/>
-              <w:left w:val="none" w:sz="0" w:space="0" w:color="000000"/>
-              <w:right w:val="none" w:sz="0" w:space="0" w:color="000000"/>
-            </w:tcBorders>
-            <w:shd w:val="clear" w:color="auto" w:fill="FFFFFF"/>
-            <w:tcMar>
-              <w:top w:w="0" w:type="dxa"/>
-              <w:bottom w:w="0" w:type="dxa"/>
-              <w:left w:w="0" w:type="dxa"/>
-              <w:right w:w="0" w:type="dxa"/>
-            </w:tcMar>
-            <w:vAlign w:val="center"/>
-          </w:tcPr>
-          <w:p>
-            <w:pPr>
-              <w:pStyle w:val="Normal"/>
-              <w:jc w:val="left"/>
-              <w:pBdr>
-                <w:bottom w:val="none" w:sz="0" w:space="0" w:color="000000"/>
-                <w:top w:val="none" w:sz="0" w:space="0" w:color="000000"/>
-                <w:left w:val="none" w:sz="0" w:space="0" w:color="000000"/>
-                <w:right w:val="none" w:sz="0" w:space="0" w:color="000000"/>
-              </w:pBdr>
-              <w:spacing w:after="100" w:before="100" w:line="240"/>
-              <w:ind w:left="100" w:right="100" w:firstLine="0" w:firstLineChars="0"/>
-              <w:rPr>
-                <w:rFonts w:ascii="Times New Roman" w:hAnsi="Arial" w:eastAsia="Arial" w:cs="Arial"/>
-                <w:i w:val="false"/>
-                <w:b w:val="false"/>
-                <w:u w:val="none"/>
-                <w:strike w:val="false"/>
-                <w:sz w:val="24"/>
-                <w:szCs w:val="24"/>
-                <w:color w:val="000000"/>
-              </w:rPr>
-            </w:pPr>
-            <w:r>
-              <w:rPr>
-                <w:rFonts w:ascii="Times New Roman" w:hAnsi="Arial" w:eastAsia="Arial" w:cs="Arial"/>
-                <w:i w:val="false"/>
-                <w:b w:val="false"/>
-                <w:u w:val="none"/>
-                <w:strike w:val="false"/>
-                <w:sz w:val="24"/>
-                <w:szCs w:val="24"/>
-                <w:color w:val="000000"/>
-              </w:rPr>
-              <w:t xml:space="preserve">2021-02-01 (2020-07-01 to 2021-08-01)</w:t>
+              <w:top w:val="single" w:sz="12" w:space="0" w:color="666666"/>
+              <w:left w:val="none" w:sz="0" w:space="0" w:color="000000"/>
+              <w:right w:val="none" w:sz="0" w:space="0" w:color="000000"/>
+            </w:tcBorders>
+            <w:shd w:val="clear" w:color="auto" w:fill="FFFFFF"/>
+            <w:tcMar>
+              <w:top w:w="0" w:type="dxa"/>
+              <w:bottom w:w="0" w:type="dxa"/>
+              <w:left w:w="0" w:type="dxa"/>
+              <w:right w:w="0" w:type="dxa"/>
+            </w:tcMar>
+            <w:vAlign w:val="center"/>
+          </w:tcPr>
+          <w:p>
+            <w:pPr>
+              <w:pStyle w:val="Normal"/>
+              <w:jc w:val="left"/>
+              <w:pBdr>
+                <w:bottom w:val="none" w:sz="0" w:space="0" w:color="000000"/>
+                <w:top w:val="none" w:sz="0" w:space="0" w:color="000000"/>
+                <w:left w:val="none" w:sz="0" w:space="0" w:color="000000"/>
+                <w:right w:val="none" w:sz="0" w:space="0" w:color="000000"/>
+              </w:pBdr>
+              <w:spacing w:after="100" w:before="100" w:line="240"/>
+              <w:ind w:left="100" w:right="100" w:firstLine="0" w:firstLineChars="0"/>
+              <w:rPr>
+                <w:rFonts w:ascii="Times New Roman" w:hAnsi="Arial" w:eastAsia="Arial" w:cs="Arial"/>
+                <w:i w:val="false"/>
+                <w:b w:val="true"/>
+                <w:u w:val="none"/>
+                <w:strike w:val="false"/>
+                <w:sz w:val="24"/>
+                <w:szCs w:val="24"/>
+                <w:color w:val="000000"/>
+              </w:rPr>
+            </w:pPr>
+            <w:r>
+              <w:rPr>
+                <w:rFonts w:ascii="Times New Roman" w:hAnsi="Arial" w:eastAsia="Arial" w:cs="Arial"/>
+                <w:i w:val="false"/>
+                <w:b w:val="true"/>
+                <w:u w:val="none"/>
+                <w:strike w:val="false"/>
+                <w:sz w:val="24"/>
+                <w:szCs w:val="24"/>
+                <w:color w:val="000000"/>
+              </w:rPr>
+              <w:t xml:space="preserve"/>
             </w:r>
           </w:p>
         </w:tc>
@@ -1221,54 +1221,54 @@
           <w:tcPr>
             <w:tcBorders>
               <w:bottom w:val="single" w:sz="12" w:space="0" w:color="666666"/>
-              <w:top w:val="none" w:sz="0" w:space="0" w:color="000000"/>
-              <w:left w:val="none" w:sz="0" w:space="0" w:color="000000"/>
-              <w:right w:val="none" w:sz="0" w:space="0" w:color="000000"/>
-            </w:tcBorders>
-            <w:shd w:val="clear" w:color="auto" w:fill="FFFFFF"/>
-            <w:tcMar>
-              <w:top w:w="0" w:type="dxa"/>
-              <w:bottom w:w="0" w:type="dxa"/>
-              <w:left w:w="0" w:type="dxa"/>
-              <w:right w:w="0" w:type="dxa"/>
-            </w:tcMar>
-            <w:vAlign w:val="center"/>
-          </w:tcPr>
-          <w:p>
-            <w:pPr>
-              <w:pStyle w:val="Normal"/>
-              <w:jc w:val="left"/>
-              <w:pBdr>
-                <w:bottom w:val="none" w:sz="0" w:space="0" w:color="000000"/>
-                <w:top w:val="none" w:sz="0" w:space="0" w:color="000000"/>
-                <w:left w:val="none" w:sz="0" w:space="0" w:color="000000"/>
-                <w:right w:val="none" w:sz="0" w:space="0" w:color="000000"/>
-              </w:pBdr>
-              <w:spacing w:after="100" w:before="100" w:line="240"/>
-              <w:ind w:left="100" w:right="100" w:firstLine="0" w:firstLineChars="0"/>
-              <w:rPr>
-                <w:rFonts w:ascii="Times New Roman" w:hAnsi="Arial" w:eastAsia="Arial" w:cs="Arial"/>
-                <w:i w:val="false"/>
-                <w:b w:val="false"/>
-                <w:u w:val="none"/>
-                <w:strike w:val="false"/>
-                <w:sz w:val="24"/>
-                <w:szCs w:val="24"/>
-                <w:color w:val="000000"/>
-              </w:rPr>
-            </w:pPr>
-            <w:r>
-              <w:rPr>
-                <w:rFonts w:ascii="Times New Roman" w:hAnsi="Arial" w:eastAsia="Arial" w:cs="Arial"/>
-                <w:i w:val="false"/>
-                <w:b w:val="false"/>
-                <w:u w:val="none"/>
-                <w:strike w:val="false"/>
-                <w:sz w:val="24"/>
-                <w:szCs w:val="24"/>
-                <w:color w:val="000000"/>
-              </w:rPr>
-              <w:t xml:space="preserve">1.2% (1.16% to 1.24%)</w:t>
+              <w:top w:val="single" w:sz="12" w:space="0" w:color="666666"/>
+              <w:left w:val="none" w:sz="0" w:space="0" w:color="000000"/>
+              <w:right w:val="none" w:sz="0" w:space="0" w:color="000000"/>
+            </w:tcBorders>
+            <w:shd w:val="clear" w:color="auto" w:fill="FFFFFF"/>
+            <w:tcMar>
+              <w:top w:w="0" w:type="dxa"/>
+              <w:bottom w:w="0" w:type="dxa"/>
+              <w:left w:w="0" w:type="dxa"/>
+              <w:right w:w="0" w:type="dxa"/>
+            </w:tcMar>
+            <w:vAlign w:val="center"/>
+          </w:tcPr>
+          <w:p>
+            <w:pPr>
+              <w:pStyle w:val="Normal"/>
+              <w:jc w:val="left"/>
+              <w:pBdr>
+                <w:bottom w:val="none" w:sz="0" w:space="0" w:color="000000"/>
+                <w:top w:val="none" w:sz="0" w:space="0" w:color="000000"/>
+                <w:left w:val="none" w:sz="0" w:space="0" w:color="000000"/>
+                <w:right w:val="none" w:sz="0" w:space="0" w:color="000000"/>
+              </w:pBdr>
+              <w:spacing w:after="100" w:before="100" w:line="240"/>
+              <w:ind w:left="100" w:right="100" w:firstLine="0" w:firstLineChars="0"/>
+              <w:rPr>
+                <w:rFonts w:ascii="Times New Roman" w:hAnsi="Arial" w:eastAsia="Arial" w:cs="Arial"/>
+                <w:i w:val="false"/>
+                <w:b w:val="true"/>
+                <w:u w:val="none"/>
+                <w:strike w:val="false"/>
+                <w:sz w:val="24"/>
+                <w:szCs w:val="24"/>
+                <w:color w:val="000000"/>
+              </w:rPr>
+            </w:pPr>
+            <w:r>
+              <w:rPr>
+                <w:rFonts w:ascii="Times New Roman" w:hAnsi="Arial" w:eastAsia="Arial" w:cs="Arial"/>
+                <w:i w:val="false"/>
+                <w:b w:val="true"/>
+                <w:u w:val="none"/>
+                <w:strike w:val="false"/>
+                <w:sz w:val="24"/>
+                <w:szCs w:val="24"/>
+                <w:color w:val="000000"/>
+              </w:rPr>
+              <w:t xml:space="preserve">1.76% (1.41% to 2.11%)</w:t>
             </w:r>
           </w:p>
         </w:tc>
@@ -1276,54 +1276,54 @@
           <w:tcPr>
             <w:tcBorders>
               <w:bottom w:val="single" w:sz="12" w:space="0" w:color="666666"/>
-              <w:top w:val="none" w:sz="0" w:space="0" w:color="000000"/>
-              <w:left w:val="none" w:sz="0" w:space="0" w:color="000000"/>
-              <w:right w:val="none" w:sz="0" w:space="0" w:color="000000"/>
-            </w:tcBorders>
-            <w:shd w:val="clear" w:color="auto" w:fill="FFFFFF"/>
-            <w:tcMar>
-              <w:top w:w="0" w:type="dxa"/>
-              <w:bottom w:w="0" w:type="dxa"/>
-              <w:left w:w="0" w:type="dxa"/>
-              <w:right w:w="0" w:type="dxa"/>
-            </w:tcMar>
-            <w:vAlign w:val="center"/>
-          </w:tcPr>
-          <w:p>
-            <w:pPr>
-              <w:pStyle w:val="Normal"/>
-              <w:jc w:val="left"/>
-              <w:pBdr>
-                <w:bottom w:val="none" w:sz="0" w:space="0" w:color="000000"/>
-                <w:top w:val="none" w:sz="0" w:space="0" w:color="000000"/>
-                <w:left w:val="none" w:sz="0" w:space="0" w:color="000000"/>
-                <w:right w:val="none" w:sz="0" w:space="0" w:color="000000"/>
-              </w:pBdr>
-              <w:spacing w:after="100" w:before="100" w:line="240"/>
-              <w:ind w:left="100" w:right="100" w:firstLine="0" w:firstLineChars="0"/>
-              <w:rPr>
-                <w:rFonts w:ascii="Times New Roman" w:hAnsi="Arial" w:eastAsia="Arial" w:cs="Arial"/>
-                <w:i w:val="false"/>
-                <w:b w:val="false"/>
-                <w:u w:val="none"/>
-                <w:strike w:val="false"/>
-                <w:sz w:val="24"/>
-                <w:szCs w:val="24"/>
-                <w:color w:val="000000"/>
-              </w:rPr>
-            </w:pPr>
-            <w:r>
-              <w:rPr>
-                <w:rFonts w:ascii="Times New Roman" w:hAnsi="Arial" w:eastAsia="Arial" w:cs="Arial"/>
-                <w:i w:val="false"/>
-                <w:b w:val="false"/>
-                <w:u w:val="none"/>
-                <w:strike w:val="false"/>
-                <w:sz w:val="24"/>
-                <w:szCs w:val="24"/>
-                <w:color w:val="000000"/>
-              </w:rPr>
-              <w:t xml:space="preserve">0.4% (0.3% to 0.51%)</w:t>
+              <w:top w:val="single" w:sz="12" w:space="0" w:color="666666"/>
+              <w:left w:val="none" w:sz="0" w:space="0" w:color="000000"/>
+              <w:right w:val="none" w:sz="0" w:space="0" w:color="000000"/>
+            </w:tcBorders>
+            <w:shd w:val="clear" w:color="auto" w:fill="FFFFFF"/>
+            <w:tcMar>
+              <w:top w:w="0" w:type="dxa"/>
+              <w:bottom w:w="0" w:type="dxa"/>
+              <w:left w:w="0" w:type="dxa"/>
+              <w:right w:w="0" w:type="dxa"/>
+            </w:tcMar>
+            <w:vAlign w:val="center"/>
+          </w:tcPr>
+          <w:p>
+            <w:pPr>
+              <w:pStyle w:val="Normal"/>
+              <w:jc w:val="left"/>
+              <w:pBdr>
+                <w:bottom w:val="none" w:sz="0" w:space="0" w:color="000000"/>
+                <w:top w:val="none" w:sz="0" w:space="0" w:color="000000"/>
+                <w:left w:val="none" w:sz="0" w:space="0" w:color="000000"/>
+                <w:right w:val="none" w:sz="0" w:space="0" w:color="000000"/>
+              </w:pBdr>
+              <w:spacing w:after="100" w:before="100" w:line="240"/>
+              <w:ind w:left="100" w:right="100" w:firstLine="0" w:firstLineChars="0"/>
+              <w:rPr>
+                <w:rFonts w:ascii="Times New Roman" w:hAnsi="Arial" w:eastAsia="Arial" w:cs="Arial"/>
+                <w:i w:val="false"/>
+                <w:b w:val="true"/>
+                <w:u w:val="none"/>
+                <w:strike w:val="false"/>
+                <w:sz w:val="24"/>
+                <w:szCs w:val="24"/>
+                <w:color w:val="000000"/>
+              </w:rPr>
+            </w:pPr>
+            <w:r>
+              <w:rPr>
+                <w:rFonts w:ascii="Times New Roman" w:hAnsi="Arial" w:eastAsia="Arial" w:cs="Arial"/>
+                <w:i w:val="false"/>
+                <w:b w:val="true"/>
+                <w:u w:val="none"/>
+                <w:strike w:val="false"/>
+                <w:sz w:val="24"/>
+                <w:szCs w:val="24"/>
+                <w:color w:val="000000"/>
+              </w:rPr>
+              <w:t xml:space="preserve"/>
             </w:r>
           </w:p>
         </w:tc>
@@ -1331,47 +1331,47 @@
           <w:tcPr>
             <w:tcBorders>
               <w:bottom w:val="single" w:sz="12" w:space="0" w:color="666666"/>
-              <w:top w:val="none" w:sz="0" w:space="0" w:color="000000"/>
-              <w:left w:val="none" w:sz="0" w:space="0" w:color="000000"/>
-              <w:right w:val="none" w:sz="0" w:space="0" w:color="000000"/>
-            </w:tcBorders>
-            <w:shd w:val="clear" w:color="auto" w:fill="FFFFFF"/>
-            <w:tcMar>
-              <w:top w:w="0" w:type="dxa"/>
-              <w:bottom w:w="0" w:type="dxa"/>
-              <w:left w:w="0" w:type="dxa"/>
-              <w:right w:w="0" w:type="dxa"/>
-            </w:tcMar>
-            <w:vAlign w:val="center"/>
-          </w:tcPr>
-          <w:p>
-            <w:pPr>
-              <w:pStyle w:val="Normal"/>
-              <w:jc w:val="left"/>
-              <w:pBdr>
-                <w:bottom w:val="none" w:sz="0" w:space="0" w:color="000000"/>
-                <w:top w:val="none" w:sz="0" w:space="0" w:color="000000"/>
-                <w:left w:val="none" w:sz="0" w:space="0" w:color="000000"/>
-                <w:right w:val="none" w:sz="0" w:space="0" w:color="000000"/>
-              </w:pBdr>
-              <w:spacing w:after="100" w:before="100" w:line="240"/>
-              <w:ind w:left="100" w:right="100" w:firstLine="0" w:firstLineChars="0"/>
-              <w:rPr>
-                <w:rFonts w:ascii="Times New Roman" w:hAnsi="Arial" w:eastAsia="Arial" w:cs="Arial"/>
-                <w:i w:val="false"/>
-                <w:b w:val="false"/>
-                <w:u w:val="none"/>
-                <w:strike w:val="false"/>
-                <w:sz w:val="24"/>
-                <w:szCs w:val="24"/>
-                <w:color w:val="000000"/>
-              </w:rPr>
-            </w:pPr>
-            <w:r>
-              <w:rPr>
-                <w:rFonts w:ascii="Times New Roman" w:hAnsi="Arial" w:eastAsia="Arial" w:cs="Arial"/>
-                <w:i w:val="false"/>
-                <w:b w:val="false"/>
+              <w:top w:val="single" w:sz="12" w:space="0" w:color="666666"/>
+              <w:left w:val="none" w:sz="0" w:space="0" w:color="000000"/>
+              <w:right w:val="none" w:sz="0" w:space="0" w:color="000000"/>
+            </w:tcBorders>
+            <w:shd w:val="clear" w:color="auto" w:fill="FFFFFF"/>
+            <w:tcMar>
+              <w:top w:w="0" w:type="dxa"/>
+              <w:bottom w:w="0" w:type="dxa"/>
+              <w:left w:w="0" w:type="dxa"/>
+              <w:right w:w="0" w:type="dxa"/>
+            </w:tcMar>
+            <w:vAlign w:val="center"/>
+          </w:tcPr>
+          <w:p>
+            <w:pPr>
+              <w:pStyle w:val="Normal"/>
+              <w:jc w:val="left"/>
+              <w:pBdr>
+                <w:bottom w:val="none" w:sz="0" w:space="0" w:color="000000"/>
+                <w:top w:val="none" w:sz="0" w:space="0" w:color="000000"/>
+                <w:left w:val="none" w:sz="0" w:space="0" w:color="000000"/>
+                <w:right w:val="none" w:sz="0" w:space="0" w:color="000000"/>
+              </w:pBdr>
+              <w:spacing w:after="100" w:before="100" w:line="240"/>
+              <w:ind w:left="100" w:right="100" w:firstLine="0" w:firstLineChars="0"/>
+              <w:rPr>
+                <w:rFonts w:ascii="Times New Roman" w:hAnsi="Arial" w:eastAsia="Arial" w:cs="Arial"/>
+                <w:i w:val="false"/>
+                <w:b w:val="true"/>
+                <w:u w:val="none"/>
+                <w:strike w:val="false"/>
+                <w:sz w:val="24"/>
+                <w:szCs w:val="24"/>
+                <w:color w:val="000000"/>
+              </w:rPr>
+            </w:pPr>
+            <w:r>
+              <w:rPr>
+                <w:rFonts w:ascii="Times New Roman" w:hAnsi="Arial" w:eastAsia="Arial" w:cs="Arial"/>
+                <w:i w:val="false"/>
+                <w:b w:val="true"/>
                 <w:u w:val="none"/>
                 <w:strike w:val="false"/>
                 <w:sz w:val="24"/>
@@ -1390,7 +1390,7 @@
         <w:tc>
           <w:tcPr>
             <w:tcBorders>
-              <w:bottom w:val="single" w:sz="12" w:space="0" w:color="666666"/>
+              <w:bottom w:val="none" w:sz="0" w:space="0" w:color="000000"/>
               <w:top w:val="single" w:sz="12" w:space="0" w:color="666666"/>
               <w:left w:val="none" w:sz="0" w:space="0" w:color="000000"/>
               <w:right w:val="none" w:sz="0" w:space="0" w:color="000000"/>
@@ -1419,19 +1419,19 @@
               <w:rPr>
                 <w:rFonts w:ascii="Times New Roman" w:hAnsi="Arial" w:eastAsia="Arial" w:cs="Arial"/>
                 <w:i w:val="false"/>
-                <w:b w:val="true"/>
-                <w:u w:val="none"/>
-                <w:strike w:val="false"/>
-                <w:sz w:val="24"/>
-                <w:szCs w:val="24"/>
-                <w:color w:val="000000"/>
-              </w:rPr>
-            </w:pPr>
-            <w:r>
-              <w:rPr>
-                <w:rFonts w:ascii="Times New Roman" w:hAnsi="Arial" w:eastAsia="Arial" w:cs="Arial"/>
-                <w:i w:val="false"/>
-                <w:b w:val="true"/>
+                <w:b w:val="false"/>
+                <w:u w:val="none"/>
+                <w:strike w:val="false"/>
+                <w:sz w:val="24"/>
+                <w:szCs w:val="24"/>
+                <w:color w:val="000000"/>
+              </w:rPr>
+            </w:pPr>
+            <w:r>
+              <w:rPr>
+                <w:rFonts w:ascii="Times New Roman" w:hAnsi="Arial" w:eastAsia="Arial" w:cs="Arial"/>
+                <w:i w:val="false"/>
+                <w:b w:val="false"/>
                 <w:u w:val="none"/>
                 <w:strike w:val="false"/>
                 <w:sz w:val="24"/>
@@ -1445,7 +1445,7 @@
         <w:tc>
           <w:tcPr>
             <w:tcBorders>
-              <w:bottom w:val="single" w:sz="12" w:space="0" w:color="666666"/>
+              <w:bottom w:val="none" w:sz="0" w:space="0" w:color="000000"/>
               <w:top w:val="single" w:sz="12" w:space="0" w:color="666666"/>
               <w:left w:val="none" w:sz="0" w:space="0" w:color="000000"/>
               <w:right w:val="none" w:sz="0" w:space="0" w:color="000000"/>
@@ -1474,33 +1474,33 @@
               <w:rPr>
                 <w:rFonts w:ascii="Times New Roman" w:hAnsi="Arial" w:eastAsia="Arial" w:cs="Arial"/>
                 <w:i w:val="false"/>
-                <w:b w:val="true"/>
-                <w:u w:val="none"/>
-                <w:strike w:val="false"/>
-                <w:sz w:val="24"/>
-                <w:szCs w:val="24"/>
-                <w:color w:val="000000"/>
-              </w:rPr>
-            </w:pPr>
-            <w:r>
-              <w:rPr>
-                <w:rFonts w:ascii="Times New Roman" w:hAnsi="Arial" w:eastAsia="Arial" w:cs="Arial"/>
-                <w:i w:val="false"/>
-                <w:b w:val="true"/>
-                <w:u w:val="none"/>
-                <w:strike w:val="false"/>
-                <w:sz w:val="24"/>
-                <w:szCs w:val="24"/>
-                <w:color w:val="000000"/>
-              </w:rPr>
-              <w:t xml:space="preserve">0</w:t>
-            </w:r>
-          </w:p>
-        </w:tc>
-        <w:tc>
-          <w:tcPr>
-            <w:tcBorders>
-              <w:bottom w:val="single" w:sz="12" w:space="0" w:color="666666"/>
+                <w:b w:val="false"/>
+                <w:u w:val="none"/>
+                <w:strike w:val="false"/>
+                <w:sz w:val="24"/>
+                <w:szCs w:val="24"/>
+                <w:color w:val="000000"/>
+              </w:rPr>
+            </w:pPr>
+            <w:r>
+              <w:rPr>
+                <w:rFonts w:ascii="Times New Roman" w:hAnsi="Arial" w:eastAsia="Arial" w:cs="Arial"/>
+                <w:i w:val="false"/>
+                <w:b w:val="false"/>
+                <w:u w:val="none"/>
+                <w:strike w:val="false"/>
+                <w:sz w:val="24"/>
+                <w:szCs w:val="24"/>
+                <w:color w:val="000000"/>
+              </w:rPr>
+              <w:t xml:space="preserve">1</w:t>
+            </w:r>
+          </w:p>
+        </w:tc>
+        <w:tc>
+          <w:tcPr>
+            <w:tcBorders>
+              <w:bottom w:val="none" w:sz="0" w:space="0" w:color="000000"/>
               <w:top w:val="single" w:sz="12" w:space="0" w:color="666666"/>
               <w:left w:val="none" w:sz="0" w:space="0" w:color="000000"/>
               <w:right w:val="none" w:sz="0" w:space="0" w:color="000000"/>
@@ -1529,33 +1529,33 @@
               <w:rPr>
                 <w:rFonts w:ascii="Times New Roman" w:hAnsi="Arial" w:eastAsia="Arial" w:cs="Arial"/>
                 <w:i w:val="false"/>
-                <w:b w:val="true"/>
-                <w:u w:val="none"/>
-                <w:strike w:val="false"/>
-                <w:sz w:val="24"/>
-                <w:szCs w:val="24"/>
-                <w:color w:val="000000"/>
-              </w:rPr>
-            </w:pPr>
-            <w:r>
-              <w:rPr>
-                <w:rFonts w:ascii="Times New Roman" w:hAnsi="Arial" w:eastAsia="Arial" w:cs="Arial"/>
-                <w:i w:val="false"/>
-                <w:b w:val="true"/>
-                <w:u w:val="none"/>
-                <w:strike w:val="false"/>
-                <w:sz w:val="24"/>
-                <w:szCs w:val="24"/>
-                <w:color w:val="000000"/>
-              </w:rPr>
-              <w:t xml:space="preserve"/>
-            </w:r>
-          </w:p>
-        </w:tc>
-        <w:tc>
-          <w:tcPr>
-            <w:tcBorders>
-              <w:bottom w:val="single" w:sz="12" w:space="0" w:color="666666"/>
+                <w:b w:val="false"/>
+                <w:u w:val="none"/>
+                <w:strike w:val="false"/>
+                <w:sz w:val="24"/>
+                <w:szCs w:val="24"/>
+                <w:color w:val="000000"/>
+              </w:rPr>
+            </w:pPr>
+            <w:r>
+              <w:rPr>
+                <w:rFonts w:ascii="Times New Roman" w:hAnsi="Arial" w:eastAsia="Arial" w:cs="Arial"/>
+                <w:i w:val="false"/>
+                <w:b w:val="false"/>
+                <w:u w:val="none"/>
+                <w:strike w:val="false"/>
+                <w:sz w:val="24"/>
+                <w:szCs w:val="24"/>
+                <w:color w:val="000000"/>
+              </w:rPr>
+              <w:t xml:space="preserve">2020-08-01 (2020-05-01 to 2020-10-01)</w:t>
+            </w:r>
+          </w:p>
+        </w:tc>
+        <w:tc>
+          <w:tcPr>
+            <w:tcBorders>
+              <w:bottom w:val="none" w:sz="0" w:space="0" w:color="000000"/>
               <w:top w:val="single" w:sz="12" w:space="0" w:color="666666"/>
               <w:left w:val="none" w:sz="0" w:space="0" w:color="000000"/>
               <w:right w:val="none" w:sz="0" w:space="0" w:color="000000"/>
@@ -1584,33 +1584,33 @@
               <w:rPr>
                 <w:rFonts w:ascii="Times New Roman" w:hAnsi="Arial" w:eastAsia="Arial" w:cs="Arial"/>
                 <w:i w:val="false"/>
-                <w:b w:val="true"/>
-                <w:u w:val="none"/>
-                <w:strike w:val="false"/>
-                <w:sz w:val="24"/>
-                <w:szCs w:val="24"/>
-                <w:color w:val="000000"/>
-              </w:rPr>
-            </w:pPr>
-            <w:r>
-              <w:rPr>
-                <w:rFonts w:ascii="Times New Roman" w:hAnsi="Arial" w:eastAsia="Arial" w:cs="Arial"/>
-                <w:i w:val="false"/>
-                <w:b w:val="true"/>
-                <w:u w:val="none"/>
-                <w:strike w:val="false"/>
-                <w:sz w:val="24"/>
-                <w:szCs w:val="24"/>
-                <w:color w:val="000000"/>
-              </w:rPr>
-              <w:t xml:space="preserve">1.76% (1.41% to 2.11%)</w:t>
-            </w:r>
-          </w:p>
-        </w:tc>
-        <w:tc>
-          <w:tcPr>
-            <w:tcBorders>
-              <w:bottom w:val="single" w:sz="12" w:space="0" w:color="666666"/>
+                <w:b w:val="false"/>
+                <w:u w:val="none"/>
+                <w:strike w:val="false"/>
+                <w:sz w:val="24"/>
+                <w:szCs w:val="24"/>
+                <w:color w:val="000000"/>
+              </w:rPr>
+            </w:pPr>
+            <w:r>
+              <w:rPr>
+                <w:rFonts w:ascii="Times New Roman" w:hAnsi="Arial" w:eastAsia="Arial" w:cs="Arial"/>
+                <w:i w:val="false"/>
+                <w:b w:val="false"/>
+                <w:u w:val="none"/>
+                <w:strike w:val="false"/>
+                <w:sz w:val="24"/>
+                <w:szCs w:val="24"/>
+                <w:color w:val="000000"/>
+              </w:rPr>
+              <w:t xml:space="preserve">20.38% (4.03% to 39.29%)</w:t>
+            </w:r>
+          </w:p>
+        </w:tc>
+        <w:tc>
+          <w:tcPr>
+            <w:tcBorders>
+              <w:bottom w:val="none" w:sz="0" w:space="0" w:color="000000"/>
               <w:top w:val="single" w:sz="12" w:space="0" w:color="666666"/>
               <w:left w:val="none" w:sz="0" w:space="0" w:color="000000"/>
               <w:right w:val="none" w:sz="0" w:space="0" w:color="000000"/>
@@ -1639,33 +1639,33 @@
               <w:rPr>
                 <w:rFonts w:ascii="Times New Roman" w:hAnsi="Arial" w:eastAsia="Arial" w:cs="Arial"/>
                 <w:i w:val="false"/>
-                <w:b w:val="true"/>
-                <w:u w:val="none"/>
-                <w:strike w:val="false"/>
-                <w:sz w:val="24"/>
-                <w:szCs w:val="24"/>
-                <w:color w:val="000000"/>
-              </w:rPr>
-            </w:pPr>
-            <w:r>
-              <w:rPr>
-                <w:rFonts w:ascii="Times New Roman" w:hAnsi="Arial" w:eastAsia="Arial" w:cs="Arial"/>
-                <w:i w:val="false"/>
-                <w:b w:val="true"/>
-                <w:u w:val="none"/>
-                <w:strike w:val="false"/>
-                <w:sz w:val="24"/>
-                <w:szCs w:val="24"/>
-                <w:color w:val="000000"/>
-              </w:rPr>
-              <w:t xml:space="preserve"/>
-            </w:r>
-          </w:p>
-        </w:tc>
-        <w:tc>
-          <w:tcPr>
-            <w:tcBorders>
-              <w:bottom w:val="single" w:sz="12" w:space="0" w:color="666666"/>
+                <w:b w:val="false"/>
+                <w:u w:val="none"/>
+                <w:strike w:val="false"/>
+                <w:sz w:val="24"/>
+                <w:szCs w:val="24"/>
+                <w:color w:val="000000"/>
+              </w:rPr>
+            </w:pPr>
+            <w:r>
+              <w:rPr>
+                <w:rFonts w:ascii="Times New Roman" w:hAnsi="Arial" w:eastAsia="Arial" w:cs="Arial"/>
+                <w:i w:val="false"/>
+                <w:b w:val="false"/>
+                <w:u w:val="none"/>
+                <w:strike w:val="false"/>
+                <w:sz w:val="24"/>
+                <w:szCs w:val="24"/>
+                <w:color w:val="000000"/>
+              </w:rPr>
+              <w:t xml:space="preserve">18.3% (2.23% to 36.89%)</w:t>
+            </w:r>
+          </w:p>
+        </w:tc>
+        <w:tc>
+          <w:tcPr>
+            <w:tcBorders>
+              <w:bottom w:val="none" w:sz="0" w:space="0" w:color="000000"/>
               <w:top w:val="single" w:sz="12" w:space="0" w:color="666666"/>
               <w:left w:val="none" w:sz="0" w:space="0" w:color="000000"/>
               <w:right w:val="none" w:sz="0" w:space="0" w:color="000000"/>
@@ -1694,26 +1694,26 @@
               <w:rPr>
                 <w:rFonts w:ascii="Times New Roman" w:hAnsi="Arial" w:eastAsia="Arial" w:cs="Arial"/>
                 <w:i w:val="false"/>
-                <w:b w:val="true"/>
-                <w:u w:val="none"/>
-                <w:strike w:val="false"/>
-                <w:sz w:val="24"/>
-                <w:szCs w:val="24"/>
-                <w:color w:val="000000"/>
-              </w:rPr>
-            </w:pPr>
-            <w:r>
-              <w:rPr>
-                <w:rFonts w:ascii="Times New Roman" w:hAnsi="Arial" w:eastAsia="Arial" w:cs="Arial"/>
-                <w:i w:val="false"/>
-                <w:b w:val="true"/>
-                <w:u w:val="none"/>
-                <w:strike w:val="false"/>
-                <w:sz w:val="24"/>
-                <w:szCs w:val="24"/>
-                <w:color w:val="000000"/>
-              </w:rPr>
-              <w:t xml:space="preserve"/>
+                <w:b w:val="false"/>
+                <w:u w:val="none"/>
+                <w:strike w:val="false"/>
+                <w:sz w:val="24"/>
+                <w:szCs w:val="24"/>
+                <w:color w:val="000000"/>
+              </w:rPr>
+            </w:pPr>
+            <w:r>
+              <w:rPr>
+                <w:rFonts w:ascii="Times New Roman" w:hAnsi="Arial" w:eastAsia="Arial" w:cs="Arial"/>
+                <w:i w:val="false"/>
+                <w:b w:val="false"/>
+                <w:u w:val="none"/>
+                <w:strike w:val="false"/>
+                <w:sz w:val="24"/>
+                <w:szCs w:val="24"/>
+                <w:color w:val="000000"/>
+              </w:rPr>
+              <w:t xml:space="preserve">0.098</w:t>
             </w:r>
           </w:p>
         </w:tc>
@@ -1725,341 +1725,6 @@
         <w:tc>
           <w:tcPr>
             <w:tcBorders>
-              <w:bottom w:val="none" w:sz="0" w:space="0" w:color="000000"/>
-              <w:top w:val="single" w:sz="12" w:space="0" w:color="666666"/>
-              <w:left w:val="none" w:sz="0" w:space="0" w:color="000000"/>
-              <w:right w:val="none" w:sz="0" w:space="0" w:color="000000"/>
-            </w:tcBorders>
-            <w:shd w:val="clear" w:color="auto" w:fill="FFFFFF"/>
-            <w:tcMar>
-              <w:top w:w="0" w:type="dxa"/>
-              <w:bottom w:w="0" w:type="dxa"/>
-              <w:left w:w="0" w:type="dxa"/>
-              <w:right w:w="0" w:type="dxa"/>
-            </w:tcMar>
-            <w:vAlign w:val="center"/>
-          </w:tcPr>
-          <w:p>
-            <w:pPr>
-              <w:pStyle w:val="Normal"/>
-              <w:jc w:val="left"/>
-              <w:pBdr>
-                <w:bottom w:val="none" w:sz="0" w:space="0" w:color="000000"/>
-                <w:top w:val="none" w:sz="0" w:space="0" w:color="000000"/>
-                <w:left w:val="none" w:sz="0" w:space="0" w:color="000000"/>
-                <w:right w:val="none" w:sz="0" w:space="0" w:color="000000"/>
-              </w:pBdr>
-              <w:spacing w:after="100" w:before="100" w:line="240"/>
-              <w:ind w:left="100" w:right="100" w:firstLine="0" w:firstLineChars="0"/>
-              <w:rPr>
-                <w:rFonts w:ascii="Times New Roman" w:hAnsi="Arial" w:eastAsia="Arial" w:cs="Arial"/>
-                <w:i w:val="false"/>
-                <w:b w:val="false"/>
-                <w:u w:val="none"/>
-                <w:strike w:val="false"/>
-                <w:sz w:val="24"/>
-                <w:szCs w:val="24"/>
-                <w:color w:val="000000"/>
-              </w:rPr>
-            </w:pPr>
-            <w:r>
-              <w:rPr>
-                <w:rFonts w:ascii="Times New Roman" w:hAnsi="Arial" w:eastAsia="Arial" w:cs="Arial"/>
-                <w:i w:val="false"/>
-                <w:b w:val="false"/>
-                <w:u w:val="none"/>
-                <w:strike w:val="false"/>
-                <w:sz w:val="24"/>
-                <w:szCs w:val="24"/>
-                <w:color w:val="000000"/>
-              </w:rPr>
-              <w:t xml:space="preserve">FOI</w:t>
-            </w:r>
-          </w:p>
-        </w:tc>
-        <w:tc>
-          <w:tcPr>
-            <w:tcBorders>
-              <w:bottom w:val="none" w:sz="0" w:space="0" w:color="000000"/>
-              <w:top w:val="single" w:sz="12" w:space="0" w:color="666666"/>
-              <w:left w:val="none" w:sz="0" w:space="0" w:color="000000"/>
-              <w:right w:val="none" w:sz="0" w:space="0" w:color="000000"/>
-            </w:tcBorders>
-            <w:shd w:val="clear" w:color="auto" w:fill="FFFFFF"/>
-            <w:tcMar>
-              <w:top w:w="0" w:type="dxa"/>
-              <w:bottom w:w="0" w:type="dxa"/>
-              <w:left w:w="0" w:type="dxa"/>
-              <w:right w:w="0" w:type="dxa"/>
-            </w:tcMar>
-            <w:vAlign w:val="center"/>
-          </w:tcPr>
-          <w:p>
-            <w:pPr>
-              <w:pStyle w:val="Normal"/>
-              <w:jc w:val="left"/>
-              <w:pBdr>
-                <w:bottom w:val="none" w:sz="0" w:space="0" w:color="000000"/>
-                <w:top w:val="none" w:sz="0" w:space="0" w:color="000000"/>
-                <w:left w:val="none" w:sz="0" w:space="0" w:color="000000"/>
-                <w:right w:val="none" w:sz="0" w:space="0" w:color="000000"/>
-              </w:pBdr>
-              <w:spacing w:after="100" w:before="100" w:line="240"/>
-              <w:ind w:left="100" w:right="100" w:firstLine="0" w:firstLineChars="0"/>
-              <w:rPr>
-                <w:rFonts w:ascii="Times New Roman" w:hAnsi="Arial" w:eastAsia="Arial" w:cs="Arial"/>
-                <w:i w:val="false"/>
-                <w:b w:val="false"/>
-                <w:u w:val="none"/>
-                <w:strike w:val="false"/>
-                <w:sz w:val="24"/>
-                <w:szCs w:val="24"/>
-                <w:color w:val="000000"/>
-              </w:rPr>
-            </w:pPr>
-            <w:r>
-              <w:rPr>
-                <w:rFonts w:ascii="Times New Roman" w:hAnsi="Arial" w:eastAsia="Arial" w:cs="Arial"/>
-                <w:i w:val="false"/>
-                <w:b w:val="false"/>
-                <w:u w:val="none"/>
-                <w:strike w:val="false"/>
-                <w:sz w:val="24"/>
-                <w:szCs w:val="24"/>
-                <w:color w:val="000000"/>
-              </w:rPr>
-              <w:t xml:space="preserve">1</w:t>
-            </w:r>
-          </w:p>
-        </w:tc>
-        <w:tc>
-          <w:tcPr>
-            <w:tcBorders>
-              <w:bottom w:val="none" w:sz="0" w:space="0" w:color="000000"/>
-              <w:top w:val="single" w:sz="12" w:space="0" w:color="666666"/>
-              <w:left w:val="none" w:sz="0" w:space="0" w:color="000000"/>
-              <w:right w:val="none" w:sz="0" w:space="0" w:color="000000"/>
-            </w:tcBorders>
-            <w:shd w:val="clear" w:color="auto" w:fill="FFFFFF"/>
-            <w:tcMar>
-              <w:top w:w="0" w:type="dxa"/>
-              <w:bottom w:w="0" w:type="dxa"/>
-              <w:left w:w="0" w:type="dxa"/>
-              <w:right w:w="0" w:type="dxa"/>
-            </w:tcMar>
-            <w:vAlign w:val="center"/>
-          </w:tcPr>
-          <w:p>
-            <w:pPr>
-              <w:pStyle w:val="Normal"/>
-              <w:jc w:val="left"/>
-              <w:pBdr>
-                <w:bottom w:val="none" w:sz="0" w:space="0" w:color="000000"/>
-                <w:top w:val="none" w:sz="0" w:space="0" w:color="000000"/>
-                <w:left w:val="none" w:sz="0" w:space="0" w:color="000000"/>
-                <w:right w:val="none" w:sz="0" w:space="0" w:color="000000"/>
-              </w:pBdr>
-              <w:spacing w:after="100" w:before="100" w:line="240"/>
-              <w:ind w:left="100" w:right="100" w:firstLine="0" w:firstLineChars="0"/>
-              <w:rPr>
-                <w:rFonts w:ascii="Times New Roman" w:hAnsi="Arial" w:eastAsia="Arial" w:cs="Arial"/>
-                <w:i w:val="false"/>
-                <w:b w:val="false"/>
-                <w:u w:val="none"/>
-                <w:strike w:val="false"/>
-                <w:sz w:val="24"/>
-                <w:szCs w:val="24"/>
-                <w:color w:val="000000"/>
-              </w:rPr>
-            </w:pPr>
-            <w:r>
-              <w:rPr>
-                <w:rFonts w:ascii="Times New Roman" w:hAnsi="Arial" w:eastAsia="Arial" w:cs="Arial"/>
-                <w:i w:val="false"/>
-                <w:b w:val="false"/>
-                <w:u w:val="none"/>
-                <w:strike w:val="false"/>
-                <w:sz w:val="24"/>
-                <w:szCs w:val="24"/>
-                <w:color w:val="000000"/>
-              </w:rPr>
-              <w:t xml:space="preserve">2020-08-01 (2020-05-01 to 2020-10-01)</w:t>
-            </w:r>
-          </w:p>
-        </w:tc>
-        <w:tc>
-          <w:tcPr>
-            <w:tcBorders>
-              <w:bottom w:val="none" w:sz="0" w:space="0" w:color="000000"/>
-              <w:top w:val="single" w:sz="12" w:space="0" w:color="666666"/>
-              <w:left w:val="none" w:sz="0" w:space="0" w:color="000000"/>
-              <w:right w:val="none" w:sz="0" w:space="0" w:color="000000"/>
-            </w:tcBorders>
-            <w:shd w:val="clear" w:color="auto" w:fill="FFFFFF"/>
-            <w:tcMar>
-              <w:top w:w="0" w:type="dxa"/>
-              <w:bottom w:w="0" w:type="dxa"/>
-              <w:left w:w="0" w:type="dxa"/>
-              <w:right w:w="0" w:type="dxa"/>
-            </w:tcMar>
-            <w:vAlign w:val="center"/>
-          </w:tcPr>
-          <w:p>
-            <w:pPr>
-              <w:pStyle w:val="Normal"/>
-              <w:jc w:val="left"/>
-              <w:pBdr>
-                <w:bottom w:val="none" w:sz="0" w:space="0" w:color="000000"/>
-                <w:top w:val="none" w:sz="0" w:space="0" w:color="000000"/>
-                <w:left w:val="none" w:sz="0" w:space="0" w:color="000000"/>
-                <w:right w:val="none" w:sz="0" w:space="0" w:color="000000"/>
-              </w:pBdr>
-              <w:spacing w:after="100" w:before="100" w:line="240"/>
-              <w:ind w:left="100" w:right="100" w:firstLine="0" w:firstLineChars="0"/>
-              <w:rPr>
-                <w:rFonts w:ascii="Times New Roman" w:hAnsi="Arial" w:eastAsia="Arial" w:cs="Arial"/>
-                <w:i w:val="false"/>
-                <w:b w:val="false"/>
-                <w:u w:val="none"/>
-                <w:strike w:val="false"/>
-                <w:sz w:val="24"/>
-                <w:szCs w:val="24"/>
-                <w:color w:val="000000"/>
-              </w:rPr>
-            </w:pPr>
-            <w:r>
-              <w:rPr>
-                <w:rFonts w:ascii="Times New Roman" w:hAnsi="Arial" w:eastAsia="Arial" w:cs="Arial"/>
-                <w:i w:val="false"/>
-                <w:b w:val="false"/>
-                <w:u w:val="none"/>
-                <w:strike w:val="false"/>
-                <w:sz w:val="24"/>
-                <w:szCs w:val="24"/>
-                <w:color w:val="000000"/>
-              </w:rPr>
-              <w:t xml:space="preserve">20.38% (4.03% to 39.29%)</w:t>
-            </w:r>
-          </w:p>
-        </w:tc>
-        <w:tc>
-          <w:tcPr>
-            <w:tcBorders>
-              <w:bottom w:val="none" w:sz="0" w:space="0" w:color="000000"/>
-              <w:top w:val="single" w:sz="12" w:space="0" w:color="666666"/>
-              <w:left w:val="none" w:sz="0" w:space="0" w:color="000000"/>
-              <w:right w:val="none" w:sz="0" w:space="0" w:color="000000"/>
-            </w:tcBorders>
-            <w:shd w:val="clear" w:color="auto" w:fill="FFFFFF"/>
-            <w:tcMar>
-              <w:top w:w="0" w:type="dxa"/>
-              <w:bottom w:w="0" w:type="dxa"/>
-              <w:left w:w="0" w:type="dxa"/>
-              <w:right w:w="0" w:type="dxa"/>
-            </w:tcMar>
-            <w:vAlign w:val="center"/>
-          </w:tcPr>
-          <w:p>
-            <w:pPr>
-              <w:pStyle w:val="Normal"/>
-              <w:jc w:val="left"/>
-              <w:pBdr>
-                <w:bottom w:val="none" w:sz="0" w:space="0" w:color="000000"/>
-                <w:top w:val="none" w:sz="0" w:space="0" w:color="000000"/>
-                <w:left w:val="none" w:sz="0" w:space="0" w:color="000000"/>
-                <w:right w:val="none" w:sz="0" w:space="0" w:color="000000"/>
-              </w:pBdr>
-              <w:spacing w:after="100" w:before="100" w:line="240"/>
-              <w:ind w:left="100" w:right="100" w:firstLine="0" w:firstLineChars="0"/>
-              <w:rPr>
-                <w:rFonts w:ascii="Times New Roman" w:hAnsi="Arial" w:eastAsia="Arial" w:cs="Arial"/>
-                <w:i w:val="false"/>
-                <w:b w:val="false"/>
-                <w:u w:val="none"/>
-                <w:strike w:val="false"/>
-                <w:sz w:val="24"/>
-                <w:szCs w:val="24"/>
-                <w:color w:val="000000"/>
-              </w:rPr>
-            </w:pPr>
-            <w:r>
-              <w:rPr>
-                <w:rFonts w:ascii="Times New Roman" w:hAnsi="Arial" w:eastAsia="Arial" w:cs="Arial"/>
-                <w:i w:val="false"/>
-                <w:b w:val="false"/>
-                <w:u w:val="none"/>
-                <w:strike w:val="false"/>
-                <w:sz w:val="24"/>
-                <w:szCs w:val="24"/>
-                <w:color w:val="000000"/>
-              </w:rPr>
-              <w:t xml:space="preserve"/>
-            </w:r>
-          </w:p>
-        </w:tc>
-        <w:tc>
-          <w:tcPr>
-            <w:tcBorders>
-              <w:bottom w:val="none" w:sz="0" w:space="0" w:color="000000"/>
-              <w:top w:val="single" w:sz="12" w:space="0" w:color="666666"/>
-              <w:left w:val="none" w:sz="0" w:space="0" w:color="000000"/>
-              <w:right w:val="none" w:sz="0" w:space="0" w:color="000000"/>
-            </w:tcBorders>
-            <w:shd w:val="clear" w:color="auto" w:fill="FFFFFF"/>
-            <w:tcMar>
-              <w:top w:w="0" w:type="dxa"/>
-              <w:bottom w:w="0" w:type="dxa"/>
-              <w:left w:w="0" w:type="dxa"/>
-              <w:right w:w="0" w:type="dxa"/>
-            </w:tcMar>
-            <w:vAlign w:val="center"/>
-          </w:tcPr>
-          <w:p>
-            <w:pPr>
-              <w:pStyle w:val="Normal"/>
-              <w:jc w:val="left"/>
-              <w:pBdr>
-                <w:bottom w:val="none" w:sz="0" w:space="0" w:color="000000"/>
-                <w:top w:val="none" w:sz="0" w:space="0" w:color="000000"/>
-                <w:left w:val="none" w:sz="0" w:space="0" w:color="000000"/>
-                <w:right w:val="none" w:sz="0" w:space="0" w:color="000000"/>
-              </w:pBdr>
-              <w:spacing w:after="100" w:before="100" w:line="240"/>
-              <w:ind w:left="100" w:right="100" w:firstLine="0" w:firstLineChars="0"/>
-              <w:rPr>
-                <w:rFonts w:ascii="Times New Roman" w:hAnsi="Arial" w:eastAsia="Arial" w:cs="Arial"/>
-                <w:i w:val="false"/>
-                <w:b w:val="false"/>
-                <w:u w:val="none"/>
-                <w:strike w:val="false"/>
-                <w:sz w:val="24"/>
-                <w:szCs w:val="24"/>
-                <w:color w:val="000000"/>
-              </w:rPr>
-            </w:pPr>
-            <w:r>
-              <w:rPr>
-                <w:rFonts w:ascii="Times New Roman" w:hAnsi="Arial" w:eastAsia="Arial" w:cs="Arial"/>
-                <w:i w:val="false"/>
-                <w:b w:val="false"/>
-                <w:u w:val="none"/>
-                <w:strike w:val="false"/>
-                <w:sz w:val="24"/>
-                <w:szCs w:val="24"/>
-                <w:color w:val="000000"/>
-              </w:rPr>
-              <w:t xml:space="preserve"/>
-            </w:r>
-          </w:p>
-        </w:tc>
-      </w:tr>
-      <w:tr>
-        <w:trPr>
-          <w:trHeight w:val="360" w:hRule="auto"/>
-        </w:trPr>
-        <w:tc>
-          <w:tcPr>
-            <w:tcBorders>
               <w:bottom w:val="single" w:sz="12" w:space="0" w:color="666666"/>
               <w:top w:val="none" w:sz="0" w:space="0" w:color="000000"/>
               <w:left w:val="none" w:sz="0" w:space="0" w:color="000000"/>
@@ -2328,7 +1993,7 @@
                 <w:szCs w:val="24"/>
                 <w:color w:val="000000"/>
               </w:rPr>
-              <w:t xml:space="preserve"/>
+              <w:t xml:space="preserve">-13.34% (-25.11% to 0.28%)</w:t>
             </w:r>
           </w:p>
         </w:tc>
@@ -2383,7 +2048,7 @@
                 <w:szCs w:val="24"/>
                 <w:color w:val="000000"/>
               </w:rPr>
-              <w:t xml:space="preserve"/>
+              <w:t xml:space="preserve">0.163</w:t>
             </w:r>
           </w:p>
         </w:tc>

</xml_diff>

<commit_message>
Revert "Update changepoint model"
</commit_message>
<xml_diff>
--- a/output/tables/changepoint_table.docx
+++ b/output/tables/changepoint_table.docx
@@ -598,7 +598,7 @@
                 <w:szCs w:val="24"/>
                 <w:color w:val="000000"/>
               </w:rPr>
-              <w:t xml:space="preserve">0.66% (0.58% to 0.73%)</w:t>
+              <w:t xml:space="preserve">0.54% (0.48% to 0.59%)</w:t>
             </w:r>
           </w:p>
         </w:tc>
@@ -720,7 +720,7 @@
         <w:tc>
           <w:tcPr>
             <w:tcBorders>
-              <w:bottom w:val="single" w:sz="12" w:space="0" w:color="666666"/>
+              <w:bottom w:val="none" w:sz="0" w:space="0" w:color="000000"/>
               <w:top w:val="single" w:sz="12" w:space="0" w:color="666666"/>
               <w:left w:val="none" w:sz="0" w:space="0" w:color="000000"/>
               <w:right w:val="none" w:sz="0" w:space="0" w:color="000000"/>
@@ -775,7 +775,7 @@
         <w:tc>
           <w:tcPr>
             <w:tcBorders>
-              <w:bottom w:val="single" w:sz="12" w:space="0" w:color="666666"/>
+              <w:bottom w:val="none" w:sz="0" w:space="0" w:color="000000"/>
               <w:top w:val="single" w:sz="12" w:space="0" w:color="666666"/>
               <w:left w:val="none" w:sz="0" w:space="0" w:color="000000"/>
               <w:right w:val="none" w:sz="0" w:space="0" w:color="000000"/>
@@ -830,7 +830,7 @@
         <w:tc>
           <w:tcPr>
             <w:tcBorders>
-              <w:bottom w:val="single" w:sz="12" w:space="0" w:color="666666"/>
+              <w:bottom w:val="none" w:sz="0" w:space="0" w:color="000000"/>
               <w:top w:val="single" w:sz="12" w:space="0" w:color="666666"/>
               <w:left w:val="none" w:sz="0" w:space="0" w:color="000000"/>
               <w:right w:val="none" w:sz="0" w:space="0" w:color="000000"/>
@@ -878,14 +878,14 @@
                 <w:szCs w:val="24"/>
                 <w:color w:val="000000"/>
               </w:rPr>
-              <w:t xml:space="preserve">2020-08-01 (2020-02-01 to 2021-01-01)</w:t>
-            </w:r>
-          </w:p>
-        </w:tc>
-        <w:tc>
-          <w:tcPr>
-            <w:tcBorders>
-              <w:bottom w:val="single" w:sz="12" w:space="0" w:color="666666"/>
+              <w:t xml:space="preserve">2018-04-01 (2017-04-01 to 2019-03-01)</w:t>
+            </w:r>
+          </w:p>
+        </w:tc>
+        <w:tc>
+          <w:tcPr>
+            <w:tcBorders>
+              <w:bottom w:val="none" w:sz="0" w:space="0" w:color="000000"/>
               <w:top w:val="single" w:sz="12" w:space="0" w:color="666666"/>
               <w:left w:val="none" w:sz="0" w:space="0" w:color="000000"/>
               <w:right w:val="none" w:sz="0" w:space="0" w:color="000000"/>
@@ -933,14 +933,14 @@
                 <w:szCs w:val="24"/>
                 <w:color w:val="000000"/>
               </w:rPr>
-              <w:t xml:space="preserve">1.19% (1.14% to 1.25%)</w:t>
-            </w:r>
-          </w:p>
-        </w:tc>
-        <w:tc>
-          <w:tcPr>
-            <w:tcBorders>
-              <w:bottom w:val="single" w:sz="12" w:space="0" w:color="666666"/>
+              <w:t xml:space="preserve">0.79% (0.7% to 0.89%)</w:t>
+            </w:r>
+          </w:p>
+        </w:tc>
+        <w:tc>
+          <w:tcPr>
+            <w:tcBorders>
+              <w:bottom w:val="none" w:sz="0" w:space="0" w:color="000000"/>
               <w:top w:val="single" w:sz="12" w:space="0" w:color="666666"/>
               <w:left w:val="none" w:sz="0" w:space="0" w:color="000000"/>
               <w:right w:val="none" w:sz="0" w:space="0" w:color="000000"/>
@@ -988,14 +988,14 @@
                 <w:szCs w:val="24"/>
                 <w:color w:val="000000"/>
               </w:rPr>
-              <w:t xml:space="preserve">0.54% (0.45% to 0.62%)</w:t>
-            </w:r>
-          </w:p>
-        </w:tc>
-        <w:tc>
-          <w:tcPr>
-            <w:tcBorders>
-              <w:bottom w:val="single" w:sz="12" w:space="0" w:color="666666"/>
+              <w:t xml:space="preserve">0.25% (0.15% to 0.36%)</w:t>
+            </w:r>
+          </w:p>
+        </w:tc>
+        <w:tc>
+          <w:tcPr>
+            <w:tcBorders>
+              <w:bottom w:val="none" w:sz="0" w:space="0" w:color="000000"/>
               <w:top w:val="single" w:sz="12" w:space="0" w:color="666666"/>
               <w:left w:val="none" w:sz="0" w:space="0" w:color="000000"/>
               <w:right w:val="none" w:sz="0" w:space="0" w:color="000000"/>
@@ -1056,54 +1056,54 @@
           <w:tcPr>
             <w:tcBorders>
               <w:bottom w:val="single" w:sz="12" w:space="0" w:color="666666"/>
-              <w:top w:val="single" w:sz="12" w:space="0" w:color="666666"/>
-              <w:left w:val="none" w:sz="0" w:space="0" w:color="000000"/>
-              <w:right w:val="none" w:sz="0" w:space="0" w:color="000000"/>
-            </w:tcBorders>
-            <w:shd w:val="clear" w:color="auto" w:fill="FFFFFF"/>
-            <w:tcMar>
-              <w:top w:w="0" w:type="dxa"/>
-              <w:bottom w:w="0" w:type="dxa"/>
-              <w:left w:w="0" w:type="dxa"/>
-              <w:right w:w="0" w:type="dxa"/>
-            </w:tcMar>
-            <w:vAlign w:val="center"/>
-          </w:tcPr>
-          <w:p>
-            <w:pPr>
-              <w:pStyle w:val="Normal"/>
-              <w:jc w:val="left"/>
-              <w:pBdr>
-                <w:bottom w:val="none" w:sz="0" w:space="0" w:color="000000"/>
-                <w:top w:val="none" w:sz="0" w:space="0" w:color="000000"/>
-                <w:left w:val="none" w:sz="0" w:space="0" w:color="000000"/>
-                <w:right w:val="none" w:sz="0" w:space="0" w:color="000000"/>
-              </w:pBdr>
-              <w:spacing w:after="100" w:before="100" w:line="240"/>
-              <w:ind w:left="100" w:right="100" w:firstLine="0" w:firstLineChars="0"/>
-              <w:rPr>
-                <w:rFonts w:ascii="Times New Roman" w:hAnsi="Arial" w:eastAsia="Arial" w:cs="Arial"/>
-                <w:i w:val="false"/>
-                <w:b w:val="true"/>
-                <w:u w:val="none"/>
-                <w:strike w:val="false"/>
-                <w:sz w:val="24"/>
-                <w:szCs w:val="24"/>
-                <w:color w:val="000000"/>
-              </w:rPr>
-            </w:pPr>
-            <w:r>
-              <w:rPr>
-                <w:rFonts w:ascii="Times New Roman" w:hAnsi="Arial" w:eastAsia="Arial" w:cs="Arial"/>
-                <w:i w:val="false"/>
-                <w:b w:val="true"/>
-                <w:u w:val="none"/>
-                <w:strike w:val="false"/>
-                <w:sz w:val="24"/>
-                <w:szCs w:val="24"/>
-                <w:color w:val="000000"/>
-              </w:rPr>
-              <w:t xml:space="preserve">FOI</w:t>
+              <w:top w:val="none" w:sz="0" w:space="0" w:color="000000"/>
+              <w:left w:val="none" w:sz="0" w:space="0" w:color="000000"/>
+              <w:right w:val="none" w:sz="0" w:space="0" w:color="000000"/>
+            </w:tcBorders>
+            <w:shd w:val="clear" w:color="auto" w:fill="FFFFFF"/>
+            <w:tcMar>
+              <w:top w:w="0" w:type="dxa"/>
+              <w:bottom w:w="0" w:type="dxa"/>
+              <w:left w:w="0" w:type="dxa"/>
+              <w:right w:w="0" w:type="dxa"/>
+            </w:tcMar>
+            <w:vAlign w:val="center"/>
+          </w:tcPr>
+          <w:p>
+            <w:pPr>
+              <w:pStyle w:val="Normal"/>
+              <w:jc w:val="left"/>
+              <w:pBdr>
+                <w:bottom w:val="none" w:sz="0" w:space="0" w:color="000000"/>
+                <w:top w:val="none" w:sz="0" w:space="0" w:color="000000"/>
+                <w:left w:val="none" w:sz="0" w:space="0" w:color="000000"/>
+                <w:right w:val="none" w:sz="0" w:space="0" w:color="000000"/>
+              </w:pBdr>
+              <w:spacing w:after="100" w:before="100" w:line="240"/>
+              <w:ind w:left="100" w:right="100" w:firstLine="0" w:firstLineChars="0"/>
+              <w:rPr>
+                <w:rFonts w:ascii="Times New Roman" w:hAnsi="Arial" w:eastAsia="Arial" w:cs="Arial"/>
+                <w:i w:val="false"/>
+                <w:b w:val="false"/>
+                <w:u w:val="none"/>
+                <w:strike w:val="false"/>
+                <w:sz w:val="24"/>
+                <w:szCs w:val="24"/>
+                <w:color w:val="000000"/>
+              </w:rPr>
+            </w:pPr>
+            <w:r>
+              <w:rPr>
+                <w:rFonts w:ascii="Times New Roman" w:hAnsi="Arial" w:eastAsia="Arial" w:cs="Arial"/>
+                <w:i w:val="false"/>
+                <w:b w:val="false"/>
+                <w:u w:val="none"/>
+                <w:strike w:val="false"/>
+                <w:sz w:val="24"/>
+                <w:szCs w:val="24"/>
+                <w:color w:val="000000"/>
+              </w:rPr>
+              <w:t xml:space="preserve">GP</w:t>
             </w:r>
           </w:p>
         </w:tc>
@@ -1111,54 +1111,54 @@
           <w:tcPr>
             <w:tcBorders>
               <w:bottom w:val="single" w:sz="12" w:space="0" w:color="666666"/>
-              <w:top w:val="single" w:sz="12" w:space="0" w:color="666666"/>
-              <w:left w:val="none" w:sz="0" w:space="0" w:color="000000"/>
-              <w:right w:val="none" w:sz="0" w:space="0" w:color="000000"/>
-            </w:tcBorders>
-            <w:shd w:val="clear" w:color="auto" w:fill="FFFFFF"/>
-            <w:tcMar>
-              <w:top w:w="0" w:type="dxa"/>
-              <w:bottom w:w="0" w:type="dxa"/>
-              <w:left w:w="0" w:type="dxa"/>
-              <w:right w:w="0" w:type="dxa"/>
-            </w:tcMar>
-            <w:vAlign w:val="center"/>
-          </w:tcPr>
-          <w:p>
-            <w:pPr>
-              <w:pStyle w:val="Normal"/>
-              <w:jc w:val="left"/>
-              <w:pBdr>
-                <w:bottom w:val="none" w:sz="0" w:space="0" w:color="000000"/>
-                <w:top w:val="none" w:sz="0" w:space="0" w:color="000000"/>
-                <w:left w:val="none" w:sz="0" w:space="0" w:color="000000"/>
-                <w:right w:val="none" w:sz="0" w:space="0" w:color="000000"/>
-              </w:pBdr>
-              <w:spacing w:after="100" w:before="100" w:line="240"/>
-              <w:ind w:left="100" w:right="100" w:firstLine="0" w:firstLineChars="0"/>
-              <w:rPr>
-                <w:rFonts w:ascii="Times New Roman" w:hAnsi="Arial" w:eastAsia="Arial" w:cs="Arial"/>
-                <w:i w:val="false"/>
-                <w:b w:val="true"/>
-                <w:u w:val="none"/>
-                <w:strike w:val="false"/>
-                <w:sz w:val="24"/>
-                <w:szCs w:val="24"/>
-                <w:color w:val="000000"/>
-              </w:rPr>
-            </w:pPr>
-            <w:r>
-              <w:rPr>
-                <w:rFonts w:ascii="Times New Roman" w:hAnsi="Arial" w:eastAsia="Arial" w:cs="Arial"/>
-                <w:i w:val="false"/>
-                <w:b w:val="true"/>
-                <w:u w:val="none"/>
-                <w:strike w:val="false"/>
-                <w:sz w:val="24"/>
-                <w:szCs w:val="24"/>
-                <w:color w:val="000000"/>
-              </w:rPr>
-              <w:t xml:space="preserve">0</w:t>
+              <w:top w:val="none" w:sz="0" w:space="0" w:color="000000"/>
+              <w:left w:val="none" w:sz="0" w:space="0" w:color="000000"/>
+              <w:right w:val="none" w:sz="0" w:space="0" w:color="000000"/>
+            </w:tcBorders>
+            <w:shd w:val="clear" w:color="auto" w:fill="FFFFFF"/>
+            <w:tcMar>
+              <w:top w:w="0" w:type="dxa"/>
+              <w:bottom w:w="0" w:type="dxa"/>
+              <w:left w:w="0" w:type="dxa"/>
+              <w:right w:w="0" w:type="dxa"/>
+            </w:tcMar>
+            <w:vAlign w:val="center"/>
+          </w:tcPr>
+          <w:p>
+            <w:pPr>
+              <w:pStyle w:val="Normal"/>
+              <w:jc w:val="left"/>
+              <w:pBdr>
+                <w:bottom w:val="none" w:sz="0" w:space="0" w:color="000000"/>
+                <w:top w:val="none" w:sz="0" w:space="0" w:color="000000"/>
+                <w:left w:val="none" w:sz="0" w:space="0" w:color="000000"/>
+                <w:right w:val="none" w:sz="0" w:space="0" w:color="000000"/>
+              </w:pBdr>
+              <w:spacing w:after="100" w:before="100" w:line="240"/>
+              <w:ind w:left="100" w:right="100" w:firstLine="0" w:firstLineChars="0"/>
+              <w:rPr>
+                <w:rFonts w:ascii="Times New Roman" w:hAnsi="Arial" w:eastAsia="Arial" w:cs="Arial"/>
+                <w:i w:val="false"/>
+                <w:b w:val="false"/>
+                <w:u w:val="none"/>
+                <w:strike w:val="false"/>
+                <w:sz w:val="24"/>
+                <w:szCs w:val="24"/>
+                <w:color w:val="000000"/>
+              </w:rPr>
+            </w:pPr>
+            <w:r>
+              <w:rPr>
+                <w:rFonts w:ascii="Times New Roman" w:hAnsi="Arial" w:eastAsia="Arial" w:cs="Arial"/>
+                <w:i w:val="false"/>
+                <w:b w:val="false"/>
+                <w:u w:val="none"/>
+                <w:strike w:val="false"/>
+                <w:sz w:val="24"/>
+                <w:szCs w:val="24"/>
+                <w:color w:val="000000"/>
+              </w:rPr>
+              <w:t xml:space="preserve">2</w:t>
             </w:r>
           </w:p>
         </w:tc>
@@ -1166,54 +1166,54 @@
           <w:tcPr>
             <w:tcBorders>
               <w:bottom w:val="single" w:sz="12" w:space="0" w:color="666666"/>
-              <w:top w:val="single" w:sz="12" w:space="0" w:color="666666"/>
-              <w:left w:val="none" w:sz="0" w:space="0" w:color="000000"/>
-              <w:right w:val="none" w:sz="0" w:space="0" w:color="000000"/>
-            </w:tcBorders>
-            <w:shd w:val="clear" w:color="auto" w:fill="FFFFFF"/>
-            <w:tcMar>
-              <w:top w:w="0" w:type="dxa"/>
-              <w:bottom w:w="0" w:type="dxa"/>
-              <w:left w:w="0" w:type="dxa"/>
-              <w:right w:w="0" w:type="dxa"/>
-            </w:tcMar>
-            <w:vAlign w:val="center"/>
-          </w:tcPr>
-          <w:p>
-            <w:pPr>
-              <w:pStyle w:val="Normal"/>
-              <w:jc w:val="left"/>
-              <w:pBdr>
-                <w:bottom w:val="none" w:sz="0" w:space="0" w:color="000000"/>
-                <w:top w:val="none" w:sz="0" w:space="0" w:color="000000"/>
-                <w:left w:val="none" w:sz="0" w:space="0" w:color="000000"/>
-                <w:right w:val="none" w:sz="0" w:space="0" w:color="000000"/>
-              </w:pBdr>
-              <w:spacing w:after="100" w:before="100" w:line="240"/>
-              <w:ind w:left="100" w:right="100" w:firstLine="0" w:firstLineChars="0"/>
-              <w:rPr>
-                <w:rFonts w:ascii="Times New Roman" w:hAnsi="Arial" w:eastAsia="Arial" w:cs="Arial"/>
-                <w:i w:val="false"/>
-                <w:b w:val="true"/>
-                <w:u w:val="none"/>
-                <w:strike w:val="false"/>
-                <w:sz w:val="24"/>
-                <w:szCs w:val="24"/>
-                <w:color w:val="000000"/>
-              </w:rPr>
-            </w:pPr>
-            <w:r>
-              <w:rPr>
-                <w:rFonts w:ascii="Times New Roman" w:hAnsi="Arial" w:eastAsia="Arial" w:cs="Arial"/>
-                <w:i w:val="false"/>
-                <w:b w:val="true"/>
-                <w:u w:val="none"/>
-                <w:strike w:val="false"/>
-                <w:sz w:val="24"/>
-                <w:szCs w:val="24"/>
-                <w:color w:val="000000"/>
-              </w:rPr>
-              <w:t xml:space="preserve"/>
+              <w:top w:val="none" w:sz="0" w:space="0" w:color="000000"/>
+              <w:left w:val="none" w:sz="0" w:space="0" w:color="000000"/>
+              <w:right w:val="none" w:sz="0" w:space="0" w:color="000000"/>
+            </w:tcBorders>
+            <w:shd w:val="clear" w:color="auto" w:fill="FFFFFF"/>
+            <w:tcMar>
+              <w:top w:w="0" w:type="dxa"/>
+              <w:bottom w:w="0" w:type="dxa"/>
+              <w:left w:w="0" w:type="dxa"/>
+              <w:right w:w="0" w:type="dxa"/>
+            </w:tcMar>
+            <w:vAlign w:val="center"/>
+          </w:tcPr>
+          <w:p>
+            <w:pPr>
+              <w:pStyle w:val="Normal"/>
+              <w:jc w:val="left"/>
+              <w:pBdr>
+                <w:bottom w:val="none" w:sz="0" w:space="0" w:color="000000"/>
+                <w:top w:val="none" w:sz="0" w:space="0" w:color="000000"/>
+                <w:left w:val="none" w:sz="0" w:space="0" w:color="000000"/>
+                <w:right w:val="none" w:sz="0" w:space="0" w:color="000000"/>
+              </w:pBdr>
+              <w:spacing w:after="100" w:before="100" w:line="240"/>
+              <w:ind w:left="100" w:right="100" w:firstLine="0" w:firstLineChars="0"/>
+              <w:rPr>
+                <w:rFonts w:ascii="Times New Roman" w:hAnsi="Arial" w:eastAsia="Arial" w:cs="Arial"/>
+                <w:i w:val="false"/>
+                <w:b w:val="false"/>
+                <w:u w:val="none"/>
+                <w:strike w:val="false"/>
+                <w:sz w:val="24"/>
+                <w:szCs w:val="24"/>
+                <w:color w:val="000000"/>
+              </w:rPr>
+            </w:pPr>
+            <w:r>
+              <w:rPr>
+                <w:rFonts w:ascii="Times New Roman" w:hAnsi="Arial" w:eastAsia="Arial" w:cs="Arial"/>
+                <w:i w:val="false"/>
+                <w:b w:val="false"/>
+                <w:u w:val="none"/>
+                <w:strike w:val="false"/>
+                <w:sz w:val="24"/>
+                <w:szCs w:val="24"/>
+                <w:color w:val="000000"/>
+              </w:rPr>
+              <w:t xml:space="preserve">2021-02-01 (2020-07-01 to 2021-08-01)</w:t>
             </w:r>
           </w:p>
         </w:tc>
@@ -1221,54 +1221,54 @@
           <w:tcPr>
             <w:tcBorders>
               <w:bottom w:val="single" w:sz="12" w:space="0" w:color="666666"/>
-              <w:top w:val="single" w:sz="12" w:space="0" w:color="666666"/>
-              <w:left w:val="none" w:sz="0" w:space="0" w:color="000000"/>
-              <w:right w:val="none" w:sz="0" w:space="0" w:color="000000"/>
-            </w:tcBorders>
-            <w:shd w:val="clear" w:color="auto" w:fill="FFFFFF"/>
-            <w:tcMar>
-              <w:top w:w="0" w:type="dxa"/>
-              <w:bottom w:w="0" w:type="dxa"/>
-              <w:left w:w="0" w:type="dxa"/>
-              <w:right w:w="0" w:type="dxa"/>
-            </w:tcMar>
-            <w:vAlign w:val="center"/>
-          </w:tcPr>
-          <w:p>
-            <w:pPr>
-              <w:pStyle w:val="Normal"/>
-              <w:jc w:val="left"/>
-              <w:pBdr>
-                <w:bottom w:val="none" w:sz="0" w:space="0" w:color="000000"/>
-                <w:top w:val="none" w:sz="0" w:space="0" w:color="000000"/>
-                <w:left w:val="none" w:sz="0" w:space="0" w:color="000000"/>
-                <w:right w:val="none" w:sz="0" w:space="0" w:color="000000"/>
-              </w:pBdr>
-              <w:spacing w:after="100" w:before="100" w:line="240"/>
-              <w:ind w:left="100" w:right="100" w:firstLine="0" w:firstLineChars="0"/>
-              <w:rPr>
-                <w:rFonts w:ascii="Times New Roman" w:hAnsi="Arial" w:eastAsia="Arial" w:cs="Arial"/>
-                <w:i w:val="false"/>
-                <w:b w:val="true"/>
-                <w:u w:val="none"/>
-                <w:strike w:val="false"/>
-                <w:sz w:val="24"/>
-                <w:szCs w:val="24"/>
-                <w:color w:val="000000"/>
-              </w:rPr>
-            </w:pPr>
-            <w:r>
-              <w:rPr>
-                <w:rFonts w:ascii="Times New Roman" w:hAnsi="Arial" w:eastAsia="Arial" w:cs="Arial"/>
-                <w:i w:val="false"/>
-                <w:b w:val="true"/>
-                <w:u w:val="none"/>
-                <w:strike w:val="false"/>
-                <w:sz w:val="24"/>
-                <w:szCs w:val="24"/>
-                <w:color w:val="000000"/>
-              </w:rPr>
-              <w:t xml:space="preserve">1.76% (1.41% to 2.11%)</w:t>
+              <w:top w:val="none" w:sz="0" w:space="0" w:color="000000"/>
+              <w:left w:val="none" w:sz="0" w:space="0" w:color="000000"/>
+              <w:right w:val="none" w:sz="0" w:space="0" w:color="000000"/>
+            </w:tcBorders>
+            <w:shd w:val="clear" w:color="auto" w:fill="FFFFFF"/>
+            <w:tcMar>
+              <w:top w:w="0" w:type="dxa"/>
+              <w:bottom w:w="0" w:type="dxa"/>
+              <w:left w:w="0" w:type="dxa"/>
+              <w:right w:w="0" w:type="dxa"/>
+            </w:tcMar>
+            <w:vAlign w:val="center"/>
+          </w:tcPr>
+          <w:p>
+            <w:pPr>
+              <w:pStyle w:val="Normal"/>
+              <w:jc w:val="left"/>
+              <w:pBdr>
+                <w:bottom w:val="none" w:sz="0" w:space="0" w:color="000000"/>
+                <w:top w:val="none" w:sz="0" w:space="0" w:color="000000"/>
+                <w:left w:val="none" w:sz="0" w:space="0" w:color="000000"/>
+                <w:right w:val="none" w:sz="0" w:space="0" w:color="000000"/>
+              </w:pBdr>
+              <w:spacing w:after="100" w:before="100" w:line="240"/>
+              <w:ind w:left="100" w:right="100" w:firstLine="0" w:firstLineChars="0"/>
+              <w:rPr>
+                <w:rFonts w:ascii="Times New Roman" w:hAnsi="Arial" w:eastAsia="Arial" w:cs="Arial"/>
+                <w:i w:val="false"/>
+                <w:b w:val="false"/>
+                <w:u w:val="none"/>
+                <w:strike w:val="false"/>
+                <w:sz w:val="24"/>
+                <w:szCs w:val="24"/>
+                <w:color w:val="000000"/>
+              </w:rPr>
+            </w:pPr>
+            <w:r>
+              <w:rPr>
+                <w:rFonts w:ascii="Times New Roman" w:hAnsi="Arial" w:eastAsia="Arial" w:cs="Arial"/>
+                <w:i w:val="false"/>
+                <w:b w:val="false"/>
+                <w:u w:val="none"/>
+                <w:strike w:val="false"/>
+                <w:sz w:val="24"/>
+                <w:szCs w:val="24"/>
+                <w:color w:val="000000"/>
+              </w:rPr>
+              <w:t xml:space="preserve">1.2% (1.16% to 1.24%)</w:t>
             </w:r>
           </w:p>
         </w:tc>
@@ -1276,54 +1276,54 @@
           <w:tcPr>
             <w:tcBorders>
               <w:bottom w:val="single" w:sz="12" w:space="0" w:color="666666"/>
-              <w:top w:val="single" w:sz="12" w:space="0" w:color="666666"/>
-              <w:left w:val="none" w:sz="0" w:space="0" w:color="000000"/>
-              <w:right w:val="none" w:sz="0" w:space="0" w:color="000000"/>
-            </w:tcBorders>
-            <w:shd w:val="clear" w:color="auto" w:fill="FFFFFF"/>
-            <w:tcMar>
-              <w:top w:w="0" w:type="dxa"/>
-              <w:bottom w:w="0" w:type="dxa"/>
-              <w:left w:w="0" w:type="dxa"/>
-              <w:right w:w="0" w:type="dxa"/>
-            </w:tcMar>
-            <w:vAlign w:val="center"/>
-          </w:tcPr>
-          <w:p>
-            <w:pPr>
-              <w:pStyle w:val="Normal"/>
-              <w:jc w:val="left"/>
-              <w:pBdr>
-                <w:bottom w:val="none" w:sz="0" w:space="0" w:color="000000"/>
-                <w:top w:val="none" w:sz="0" w:space="0" w:color="000000"/>
-                <w:left w:val="none" w:sz="0" w:space="0" w:color="000000"/>
-                <w:right w:val="none" w:sz="0" w:space="0" w:color="000000"/>
-              </w:pBdr>
-              <w:spacing w:after="100" w:before="100" w:line="240"/>
-              <w:ind w:left="100" w:right="100" w:firstLine="0" w:firstLineChars="0"/>
-              <w:rPr>
-                <w:rFonts w:ascii="Times New Roman" w:hAnsi="Arial" w:eastAsia="Arial" w:cs="Arial"/>
-                <w:i w:val="false"/>
-                <w:b w:val="true"/>
-                <w:u w:val="none"/>
-                <w:strike w:val="false"/>
-                <w:sz w:val="24"/>
-                <w:szCs w:val="24"/>
-                <w:color w:val="000000"/>
-              </w:rPr>
-            </w:pPr>
-            <w:r>
-              <w:rPr>
-                <w:rFonts w:ascii="Times New Roman" w:hAnsi="Arial" w:eastAsia="Arial" w:cs="Arial"/>
-                <w:i w:val="false"/>
-                <w:b w:val="true"/>
-                <w:u w:val="none"/>
-                <w:strike w:val="false"/>
-                <w:sz w:val="24"/>
-                <w:szCs w:val="24"/>
-                <w:color w:val="000000"/>
-              </w:rPr>
-              <w:t xml:space="preserve"/>
+              <w:top w:val="none" w:sz="0" w:space="0" w:color="000000"/>
+              <w:left w:val="none" w:sz="0" w:space="0" w:color="000000"/>
+              <w:right w:val="none" w:sz="0" w:space="0" w:color="000000"/>
+            </w:tcBorders>
+            <w:shd w:val="clear" w:color="auto" w:fill="FFFFFF"/>
+            <w:tcMar>
+              <w:top w:w="0" w:type="dxa"/>
+              <w:bottom w:w="0" w:type="dxa"/>
+              <w:left w:w="0" w:type="dxa"/>
+              <w:right w:w="0" w:type="dxa"/>
+            </w:tcMar>
+            <w:vAlign w:val="center"/>
+          </w:tcPr>
+          <w:p>
+            <w:pPr>
+              <w:pStyle w:val="Normal"/>
+              <w:jc w:val="left"/>
+              <w:pBdr>
+                <w:bottom w:val="none" w:sz="0" w:space="0" w:color="000000"/>
+                <w:top w:val="none" w:sz="0" w:space="0" w:color="000000"/>
+                <w:left w:val="none" w:sz="0" w:space="0" w:color="000000"/>
+                <w:right w:val="none" w:sz="0" w:space="0" w:color="000000"/>
+              </w:pBdr>
+              <w:spacing w:after="100" w:before="100" w:line="240"/>
+              <w:ind w:left="100" w:right="100" w:firstLine="0" w:firstLineChars="0"/>
+              <w:rPr>
+                <w:rFonts w:ascii="Times New Roman" w:hAnsi="Arial" w:eastAsia="Arial" w:cs="Arial"/>
+                <w:i w:val="false"/>
+                <w:b w:val="false"/>
+                <w:u w:val="none"/>
+                <w:strike w:val="false"/>
+                <w:sz w:val="24"/>
+                <w:szCs w:val="24"/>
+                <w:color w:val="000000"/>
+              </w:rPr>
+            </w:pPr>
+            <w:r>
+              <w:rPr>
+                <w:rFonts w:ascii="Times New Roman" w:hAnsi="Arial" w:eastAsia="Arial" w:cs="Arial"/>
+                <w:i w:val="false"/>
+                <w:b w:val="false"/>
+                <w:u w:val="none"/>
+                <w:strike w:val="false"/>
+                <w:sz w:val="24"/>
+                <w:szCs w:val="24"/>
+                <w:color w:val="000000"/>
+              </w:rPr>
+              <w:t xml:space="preserve">0.4% (0.3% to 0.51%)</w:t>
             </w:r>
           </w:p>
         </w:tc>
@@ -1331,47 +1331,47 @@
           <w:tcPr>
             <w:tcBorders>
               <w:bottom w:val="single" w:sz="12" w:space="0" w:color="666666"/>
-              <w:top w:val="single" w:sz="12" w:space="0" w:color="666666"/>
-              <w:left w:val="none" w:sz="0" w:space="0" w:color="000000"/>
-              <w:right w:val="none" w:sz="0" w:space="0" w:color="000000"/>
-            </w:tcBorders>
-            <w:shd w:val="clear" w:color="auto" w:fill="FFFFFF"/>
-            <w:tcMar>
-              <w:top w:w="0" w:type="dxa"/>
-              <w:bottom w:w="0" w:type="dxa"/>
-              <w:left w:w="0" w:type="dxa"/>
-              <w:right w:w="0" w:type="dxa"/>
-            </w:tcMar>
-            <w:vAlign w:val="center"/>
-          </w:tcPr>
-          <w:p>
-            <w:pPr>
-              <w:pStyle w:val="Normal"/>
-              <w:jc w:val="left"/>
-              <w:pBdr>
-                <w:bottom w:val="none" w:sz="0" w:space="0" w:color="000000"/>
-                <w:top w:val="none" w:sz="0" w:space="0" w:color="000000"/>
-                <w:left w:val="none" w:sz="0" w:space="0" w:color="000000"/>
-                <w:right w:val="none" w:sz="0" w:space="0" w:color="000000"/>
-              </w:pBdr>
-              <w:spacing w:after="100" w:before="100" w:line="240"/>
-              <w:ind w:left="100" w:right="100" w:firstLine="0" w:firstLineChars="0"/>
-              <w:rPr>
-                <w:rFonts w:ascii="Times New Roman" w:hAnsi="Arial" w:eastAsia="Arial" w:cs="Arial"/>
-                <w:i w:val="false"/>
-                <w:b w:val="true"/>
-                <w:u w:val="none"/>
-                <w:strike w:val="false"/>
-                <w:sz w:val="24"/>
-                <w:szCs w:val="24"/>
-                <w:color w:val="000000"/>
-              </w:rPr>
-            </w:pPr>
-            <w:r>
-              <w:rPr>
-                <w:rFonts w:ascii="Times New Roman" w:hAnsi="Arial" w:eastAsia="Arial" w:cs="Arial"/>
-                <w:i w:val="false"/>
-                <w:b w:val="true"/>
+              <w:top w:val="none" w:sz="0" w:space="0" w:color="000000"/>
+              <w:left w:val="none" w:sz="0" w:space="0" w:color="000000"/>
+              <w:right w:val="none" w:sz="0" w:space="0" w:color="000000"/>
+            </w:tcBorders>
+            <w:shd w:val="clear" w:color="auto" w:fill="FFFFFF"/>
+            <w:tcMar>
+              <w:top w:w="0" w:type="dxa"/>
+              <w:bottom w:w="0" w:type="dxa"/>
+              <w:left w:w="0" w:type="dxa"/>
+              <w:right w:w="0" w:type="dxa"/>
+            </w:tcMar>
+            <w:vAlign w:val="center"/>
+          </w:tcPr>
+          <w:p>
+            <w:pPr>
+              <w:pStyle w:val="Normal"/>
+              <w:jc w:val="left"/>
+              <w:pBdr>
+                <w:bottom w:val="none" w:sz="0" w:space="0" w:color="000000"/>
+                <w:top w:val="none" w:sz="0" w:space="0" w:color="000000"/>
+                <w:left w:val="none" w:sz="0" w:space="0" w:color="000000"/>
+                <w:right w:val="none" w:sz="0" w:space="0" w:color="000000"/>
+              </w:pBdr>
+              <w:spacing w:after="100" w:before="100" w:line="240"/>
+              <w:ind w:left="100" w:right="100" w:firstLine="0" w:firstLineChars="0"/>
+              <w:rPr>
+                <w:rFonts w:ascii="Times New Roman" w:hAnsi="Arial" w:eastAsia="Arial" w:cs="Arial"/>
+                <w:i w:val="false"/>
+                <w:b w:val="false"/>
+                <w:u w:val="none"/>
+                <w:strike w:val="false"/>
+                <w:sz w:val="24"/>
+                <w:szCs w:val="24"/>
+                <w:color w:val="000000"/>
+              </w:rPr>
+            </w:pPr>
+            <w:r>
+              <w:rPr>
+                <w:rFonts w:ascii="Times New Roman" w:hAnsi="Arial" w:eastAsia="Arial" w:cs="Arial"/>
+                <w:i w:val="false"/>
+                <w:b w:val="false"/>
                 <w:u w:val="none"/>
                 <w:strike w:val="false"/>
                 <w:sz w:val="24"/>
@@ -1390,7 +1390,7 @@
         <w:tc>
           <w:tcPr>
             <w:tcBorders>
-              <w:bottom w:val="none" w:sz="0" w:space="0" w:color="000000"/>
+              <w:bottom w:val="single" w:sz="12" w:space="0" w:color="666666"/>
               <w:top w:val="single" w:sz="12" w:space="0" w:color="666666"/>
               <w:left w:val="none" w:sz="0" w:space="0" w:color="000000"/>
               <w:right w:val="none" w:sz="0" w:space="0" w:color="000000"/>
@@ -1419,19 +1419,19 @@
               <w:rPr>
                 <w:rFonts w:ascii="Times New Roman" w:hAnsi="Arial" w:eastAsia="Arial" w:cs="Arial"/>
                 <w:i w:val="false"/>
-                <w:b w:val="false"/>
-                <w:u w:val="none"/>
-                <w:strike w:val="false"/>
-                <w:sz w:val="24"/>
-                <w:szCs w:val="24"/>
-                <w:color w:val="000000"/>
-              </w:rPr>
-            </w:pPr>
-            <w:r>
-              <w:rPr>
-                <w:rFonts w:ascii="Times New Roman" w:hAnsi="Arial" w:eastAsia="Arial" w:cs="Arial"/>
-                <w:i w:val="false"/>
-                <w:b w:val="false"/>
+                <w:b w:val="true"/>
+                <w:u w:val="none"/>
+                <w:strike w:val="false"/>
+                <w:sz w:val="24"/>
+                <w:szCs w:val="24"/>
+                <w:color w:val="000000"/>
+              </w:rPr>
+            </w:pPr>
+            <w:r>
+              <w:rPr>
+                <w:rFonts w:ascii="Times New Roman" w:hAnsi="Arial" w:eastAsia="Arial" w:cs="Arial"/>
+                <w:i w:val="false"/>
+                <w:b w:val="true"/>
                 <w:u w:val="none"/>
                 <w:strike w:val="false"/>
                 <w:sz w:val="24"/>
@@ -1445,7 +1445,7 @@
         <w:tc>
           <w:tcPr>
             <w:tcBorders>
-              <w:bottom w:val="none" w:sz="0" w:space="0" w:color="000000"/>
+              <w:bottom w:val="single" w:sz="12" w:space="0" w:color="666666"/>
               <w:top w:val="single" w:sz="12" w:space="0" w:color="666666"/>
               <w:left w:val="none" w:sz="0" w:space="0" w:color="000000"/>
               <w:right w:val="none" w:sz="0" w:space="0" w:color="000000"/>
@@ -1474,33 +1474,33 @@
               <w:rPr>
                 <w:rFonts w:ascii="Times New Roman" w:hAnsi="Arial" w:eastAsia="Arial" w:cs="Arial"/>
                 <w:i w:val="false"/>
-                <w:b w:val="false"/>
-                <w:u w:val="none"/>
-                <w:strike w:val="false"/>
-                <w:sz w:val="24"/>
-                <w:szCs w:val="24"/>
-                <w:color w:val="000000"/>
-              </w:rPr>
-            </w:pPr>
-            <w:r>
-              <w:rPr>
-                <w:rFonts w:ascii="Times New Roman" w:hAnsi="Arial" w:eastAsia="Arial" w:cs="Arial"/>
-                <w:i w:val="false"/>
-                <w:b w:val="false"/>
-                <w:u w:val="none"/>
-                <w:strike w:val="false"/>
-                <w:sz w:val="24"/>
-                <w:szCs w:val="24"/>
-                <w:color w:val="000000"/>
-              </w:rPr>
-              <w:t xml:space="preserve">1</w:t>
-            </w:r>
-          </w:p>
-        </w:tc>
-        <w:tc>
-          <w:tcPr>
-            <w:tcBorders>
-              <w:bottom w:val="none" w:sz="0" w:space="0" w:color="000000"/>
+                <w:b w:val="true"/>
+                <w:u w:val="none"/>
+                <w:strike w:val="false"/>
+                <w:sz w:val="24"/>
+                <w:szCs w:val="24"/>
+                <w:color w:val="000000"/>
+              </w:rPr>
+            </w:pPr>
+            <w:r>
+              <w:rPr>
+                <w:rFonts w:ascii="Times New Roman" w:hAnsi="Arial" w:eastAsia="Arial" w:cs="Arial"/>
+                <w:i w:val="false"/>
+                <w:b w:val="true"/>
+                <w:u w:val="none"/>
+                <w:strike w:val="false"/>
+                <w:sz w:val="24"/>
+                <w:szCs w:val="24"/>
+                <w:color w:val="000000"/>
+              </w:rPr>
+              <w:t xml:space="preserve">0</w:t>
+            </w:r>
+          </w:p>
+        </w:tc>
+        <w:tc>
+          <w:tcPr>
+            <w:tcBorders>
+              <w:bottom w:val="single" w:sz="12" w:space="0" w:color="666666"/>
               <w:top w:val="single" w:sz="12" w:space="0" w:color="666666"/>
               <w:left w:val="none" w:sz="0" w:space="0" w:color="000000"/>
               <w:right w:val="none" w:sz="0" w:space="0" w:color="000000"/>
@@ -1529,33 +1529,33 @@
               <w:rPr>
                 <w:rFonts w:ascii="Times New Roman" w:hAnsi="Arial" w:eastAsia="Arial" w:cs="Arial"/>
                 <w:i w:val="false"/>
-                <w:b w:val="false"/>
-                <w:u w:val="none"/>
-                <w:strike w:val="false"/>
-                <w:sz w:val="24"/>
-                <w:szCs w:val="24"/>
-                <w:color w:val="000000"/>
-              </w:rPr>
-            </w:pPr>
-            <w:r>
-              <w:rPr>
-                <w:rFonts w:ascii="Times New Roman" w:hAnsi="Arial" w:eastAsia="Arial" w:cs="Arial"/>
-                <w:i w:val="false"/>
-                <w:b w:val="false"/>
-                <w:u w:val="none"/>
-                <w:strike w:val="false"/>
-                <w:sz w:val="24"/>
-                <w:szCs w:val="24"/>
-                <w:color w:val="000000"/>
-              </w:rPr>
-              <w:t xml:space="preserve">2020-08-01 (2020-05-01 to 2020-10-01)</w:t>
-            </w:r>
-          </w:p>
-        </w:tc>
-        <w:tc>
-          <w:tcPr>
-            <w:tcBorders>
-              <w:bottom w:val="none" w:sz="0" w:space="0" w:color="000000"/>
+                <w:b w:val="true"/>
+                <w:u w:val="none"/>
+                <w:strike w:val="false"/>
+                <w:sz w:val="24"/>
+                <w:szCs w:val="24"/>
+                <w:color w:val="000000"/>
+              </w:rPr>
+            </w:pPr>
+            <w:r>
+              <w:rPr>
+                <w:rFonts w:ascii="Times New Roman" w:hAnsi="Arial" w:eastAsia="Arial" w:cs="Arial"/>
+                <w:i w:val="false"/>
+                <w:b w:val="true"/>
+                <w:u w:val="none"/>
+                <w:strike w:val="false"/>
+                <w:sz w:val="24"/>
+                <w:szCs w:val="24"/>
+                <w:color w:val="000000"/>
+              </w:rPr>
+              <w:t xml:space="preserve"/>
+            </w:r>
+          </w:p>
+        </w:tc>
+        <w:tc>
+          <w:tcPr>
+            <w:tcBorders>
+              <w:bottom w:val="single" w:sz="12" w:space="0" w:color="666666"/>
               <w:top w:val="single" w:sz="12" w:space="0" w:color="666666"/>
               <w:left w:val="none" w:sz="0" w:space="0" w:color="000000"/>
               <w:right w:val="none" w:sz="0" w:space="0" w:color="000000"/>
@@ -1584,33 +1584,33 @@
               <w:rPr>
                 <w:rFonts w:ascii="Times New Roman" w:hAnsi="Arial" w:eastAsia="Arial" w:cs="Arial"/>
                 <w:i w:val="false"/>
-                <w:b w:val="false"/>
-                <w:u w:val="none"/>
-                <w:strike w:val="false"/>
-                <w:sz w:val="24"/>
-                <w:szCs w:val="24"/>
-                <w:color w:val="000000"/>
-              </w:rPr>
-            </w:pPr>
-            <w:r>
-              <w:rPr>
-                <w:rFonts w:ascii="Times New Roman" w:hAnsi="Arial" w:eastAsia="Arial" w:cs="Arial"/>
-                <w:i w:val="false"/>
-                <w:b w:val="false"/>
-                <w:u w:val="none"/>
-                <w:strike w:val="false"/>
-                <w:sz w:val="24"/>
-                <w:szCs w:val="24"/>
-                <w:color w:val="000000"/>
-              </w:rPr>
-              <w:t xml:space="preserve">20.38% (4.03% to 39.29%)</w:t>
-            </w:r>
-          </w:p>
-        </w:tc>
-        <w:tc>
-          <w:tcPr>
-            <w:tcBorders>
-              <w:bottom w:val="none" w:sz="0" w:space="0" w:color="000000"/>
+                <w:b w:val="true"/>
+                <w:u w:val="none"/>
+                <w:strike w:val="false"/>
+                <w:sz w:val="24"/>
+                <w:szCs w:val="24"/>
+                <w:color w:val="000000"/>
+              </w:rPr>
+            </w:pPr>
+            <w:r>
+              <w:rPr>
+                <w:rFonts w:ascii="Times New Roman" w:hAnsi="Arial" w:eastAsia="Arial" w:cs="Arial"/>
+                <w:i w:val="false"/>
+                <w:b w:val="true"/>
+                <w:u w:val="none"/>
+                <w:strike w:val="false"/>
+                <w:sz w:val="24"/>
+                <w:szCs w:val="24"/>
+                <w:color w:val="000000"/>
+              </w:rPr>
+              <w:t xml:space="preserve">1.76% (1.41% to 2.11%)</w:t>
+            </w:r>
+          </w:p>
+        </w:tc>
+        <w:tc>
+          <w:tcPr>
+            <w:tcBorders>
+              <w:bottom w:val="single" w:sz="12" w:space="0" w:color="666666"/>
               <w:top w:val="single" w:sz="12" w:space="0" w:color="666666"/>
               <w:left w:val="none" w:sz="0" w:space="0" w:color="000000"/>
               <w:right w:val="none" w:sz="0" w:space="0" w:color="000000"/>
@@ -1639,33 +1639,33 @@
               <w:rPr>
                 <w:rFonts w:ascii="Times New Roman" w:hAnsi="Arial" w:eastAsia="Arial" w:cs="Arial"/>
                 <w:i w:val="false"/>
-                <w:b w:val="false"/>
-                <w:u w:val="none"/>
-                <w:strike w:val="false"/>
-                <w:sz w:val="24"/>
-                <w:szCs w:val="24"/>
-                <w:color w:val="000000"/>
-              </w:rPr>
-            </w:pPr>
-            <w:r>
-              <w:rPr>
-                <w:rFonts w:ascii="Times New Roman" w:hAnsi="Arial" w:eastAsia="Arial" w:cs="Arial"/>
-                <w:i w:val="false"/>
-                <w:b w:val="false"/>
-                <w:u w:val="none"/>
-                <w:strike w:val="false"/>
-                <w:sz w:val="24"/>
-                <w:szCs w:val="24"/>
-                <w:color w:val="000000"/>
-              </w:rPr>
-              <w:t xml:space="preserve">18.3% (2.23% to 36.89%)</w:t>
-            </w:r>
-          </w:p>
-        </w:tc>
-        <w:tc>
-          <w:tcPr>
-            <w:tcBorders>
-              <w:bottom w:val="none" w:sz="0" w:space="0" w:color="000000"/>
+                <w:b w:val="true"/>
+                <w:u w:val="none"/>
+                <w:strike w:val="false"/>
+                <w:sz w:val="24"/>
+                <w:szCs w:val="24"/>
+                <w:color w:val="000000"/>
+              </w:rPr>
+            </w:pPr>
+            <w:r>
+              <w:rPr>
+                <w:rFonts w:ascii="Times New Roman" w:hAnsi="Arial" w:eastAsia="Arial" w:cs="Arial"/>
+                <w:i w:val="false"/>
+                <w:b w:val="true"/>
+                <w:u w:val="none"/>
+                <w:strike w:val="false"/>
+                <w:sz w:val="24"/>
+                <w:szCs w:val="24"/>
+                <w:color w:val="000000"/>
+              </w:rPr>
+              <w:t xml:space="preserve"/>
+            </w:r>
+          </w:p>
+        </w:tc>
+        <w:tc>
+          <w:tcPr>
+            <w:tcBorders>
+              <w:bottom w:val="single" w:sz="12" w:space="0" w:color="666666"/>
               <w:top w:val="single" w:sz="12" w:space="0" w:color="666666"/>
               <w:left w:val="none" w:sz="0" w:space="0" w:color="000000"/>
               <w:right w:val="none" w:sz="0" w:space="0" w:color="000000"/>
@@ -1694,26 +1694,26 @@
               <w:rPr>
                 <w:rFonts w:ascii="Times New Roman" w:hAnsi="Arial" w:eastAsia="Arial" w:cs="Arial"/>
                 <w:i w:val="false"/>
-                <w:b w:val="false"/>
-                <w:u w:val="none"/>
-                <w:strike w:val="false"/>
-                <w:sz w:val="24"/>
-                <w:szCs w:val="24"/>
-                <w:color w:val="000000"/>
-              </w:rPr>
-            </w:pPr>
-            <w:r>
-              <w:rPr>
-                <w:rFonts w:ascii="Times New Roman" w:hAnsi="Arial" w:eastAsia="Arial" w:cs="Arial"/>
-                <w:i w:val="false"/>
-                <w:b w:val="false"/>
-                <w:u w:val="none"/>
-                <w:strike w:val="false"/>
-                <w:sz w:val="24"/>
-                <w:szCs w:val="24"/>
-                <w:color w:val="000000"/>
-              </w:rPr>
-              <w:t xml:space="preserve">0.098</w:t>
+                <w:b w:val="true"/>
+                <w:u w:val="none"/>
+                <w:strike w:val="false"/>
+                <w:sz w:val="24"/>
+                <w:szCs w:val="24"/>
+                <w:color w:val="000000"/>
+              </w:rPr>
+            </w:pPr>
+            <w:r>
+              <w:rPr>
+                <w:rFonts w:ascii="Times New Roman" w:hAnsi="Arial" w:eastAsia="Arial" w:cs="Arial"/>
+                <w:i w:val="false"/>
+                <w:b w:val="true"/>
+                <w:u w:val="none"/>
+                <w:strike w:val="false"/>
+                <w:sz w:val="24"/>
+                <w:szCs w:val="24"/>
+                <w:color w:val="000000"/>
+              </w:rPr>
+              <w:t xml:space="preserve"/>
             </w:r>
           </w:p>
         </w:tc>
@@ -1725,6 +1725,341 @@
         <w:tc>
           <w:tcPr>
             <w:tcBorders>
+              <w:bottom w:val="none" w:sz="0" w:space="0" w:color="000000"/>
+              <w:top w:val="single" w:sz="12" w:space="0" w:color="666666"/>
+              <w:left w:val="none" w:sz="0" w:space="0" w:color="000000"/>
+              <w:right w:val="none" w:sz="0" w:space="0" w:color="000000"/>
+            </w:tcBorders>
+            <w:shd w:val="clear" w:color="auto" w:fill="FFFFFF"/>
+            <w:tcMar>
+              <w:top w:w="0" w:type="dxa"/>
+              <w:bottom w:w="0" w:type="dxa"/>
+              <w:left w:w="0" w:type="dxa"/>
+              <w:right w:w="0" w:type="dxa"/>
+            </w:tcMar>
+            <w:vAlign w:val="center"/>
+          </w:tcPr>
+          <w:p>
+            <w:pPr>
+              <w:pStyle w:val="Normal"/>
+              <w:jc w:val="left"/>
+              <w:pBdr>
+                <w:bottom w:val="none" w:sz="0" w:space="0" w:color="000000"/>
+                <w:top w:val="none" w:sz="0" w:space="0" w:color="000000"/>
+                <w:left w:val="none" w:sz="0" w:space="0" w:color="000000"/>
+                <w:right w:val="none" w:sz="0" w:space="0" w:color="000000"/>
+              </w:pBdr>
+              <w:spacing w:after="100" w:before="100" w:line="240"/>
+              <w:ind w:left="100" w:right="100" w:firstLine="0" w:firstLineChars="0"/>
+              <w:rPr>
+                <w:rFonts w:ascii="Times New Roman" w:hAnsi="Arial" w:eastAsia="Arial" w:cs="Arial"/>
+                <w:i w:val="false"/>
+                <w:b w:val="false"/>
+                <w:u w:val="none"/>
+                <w:strike w:val="false"/>
+                <w:sz w:val="24"/>
+                <w:szCs w:val="24"/>
+                <w:color w:val="000000"/>
+              </w:rPr>
+            </w:pPr>
+            <w:r>
+              <w:rPr>
+                <w:rFonts w:ascii="Times New Roman" w:hAnsi="Arial" w:eastAsia="Arial" w:cs="Arial"/>
+                <w:i w:val="false"/>
+                <w:b w:val="false"/>
+                <w:u w:val="none"/>
+                <w:strike w:val="false"/>
+                <w:sz w:val="24"/>
+                <w:szCs w:val="24"/>
+                <w:color w:val="000000"/>
+              </w:rPr>
+              <w:t xml:space="preserve">FOI</w:t>
+            </w:r>
+          </w:p>
+        </w:tc>
+        <w:tc>
+          <w:tcPr>
+            <w:tcBorders>
+              <w:bottom w:val="none" w:sz="0" w:space="0" w:color="000000"/>
+              <w:top w:val="single" w:sz="12" w:space="0" w:color="666666"/>
+              <w:left w:val="none" w:sz="0" w:space="0" w:color="000000"/>
+              <w:right w:val="none" w:sz="0" w:space="0" w:color="000000"/>
+            </w:tcBorders>
+            <w:shd w:val="clear" w:color="auto" w:fill="FFFFFF"/>
+            <w:tcMar>
+              <w:top w:w="0" w:type="dxa"/>
+              <w:bottom w:w="0" w:type="dxa"/>
+              <w:left w:w="0" w:type="dxa"/>
+              <w:right w:w="0" w:type="dxa"/>
+            </w:tcMar>
+            <w:vAlign w:val="center"/>
+          </w:tcPr>
+          <w:p>
+            <w:pPr>
+              <w:pStyle w:val="Normal"/>
+              <w:jc w:val="left"/>
+              <w:pBdr>
+                <w:bottom w:val="none" w:sz="0" w:space="0" w:color="000000"/>
+                <w:top w:val="none" w:sz="0" w:space="0" w:color="000000"/>
+                <w:left w:val="none" w:sz="0" w:space="0" w:color="000000"/>
+                <w:right w:val="none" w:sz="0" w:space="0" w:color="000000"/>
+              </w:pBdr>
+              <w:spacing w:after="100" w:before="100" w:line="240"/>
+              <w:ind w:left="100" w:right="100" w:firstLine="0" w:firstLineChars="0"/>
+              <w:rPr>
+                <w:rFonts w:ascii="Times New Roman" w:hAnsi="Arial" w:eastAsia="Arial" w:cs="Arial"/>
+                <w:i w:val="false"/>
+                <w:b w:val="false"/>
+                <w:u w:val="none"/>
+                <w:strike w:val="false"/>
+                <w:sz w:val="24"/>
+                <w:szCs w:val="24"/>
+                <w:color w:val="000000"/>
+              </w:rPr>
+            </w:pPr>
+            <w:r>
+              <w:rPr>
+                <w:rFonts w:ascii="Times New Roman" w:hAnsi="Arial" w:eastAsia="Arial" w:cs="Arial"/>
+                <w:i w:val="false"/>
+                <w:b w:val="false"/>
+                <w:u w:val="none"/>
+                <w:strike w:val="false"/>
+                <w:sz w:val="24"/>
+                <w:szCs w:val="24"/>
+                <w:color w:val="000000"/>
+              </w:rPr>
+              <w:t xml:space="preserve">1</w:t>
+            </w:r>
+          </w:p>
+        </w:tc>
+        <w:tc>
+          <w:tcPr>
+            <w:tcBorders>
+              <w:bottom w:val="none" w:sz="0" w:space="0" w:color="000000"/>
+              <w:top w:val="single" w:sz="12" w:space="0" w:color="666666"/>
+              <w:left w:val="none" w:sz="0" w:space="0" w:color="000000"/>
+              <w:right w:val="none" w:sz="0" w:space="0" w:color="000000"/>
+            </w:tcBorders>
+            <w:shd w:val="clear" w:color="auto" w:fill="FFFFFF"/>
+            <w:tcMar>
+              <w:top w:w="0" w:type="dxa"/>
+              <w:bottom w:w="0" w:type="dxa"/>
+              <w:left w:w="0" w:type="dxa"/>
+              <w:right w:w="0" w:type="dxa"/>
+            </w:tcMar>
+            <w:vAlign w:val="center"/>
+          </w:tcPr>
+          <w:p>
+            <w:pPr>
+              <w:pStyle w:val="Normal"/>
+              <w:jc w:val="left"/>
+              <w:pBdr>
+                <w:bottom w:val="none" w:sz="0" w:space="0" w:color="000000"/>
+                <w:top w:val="none" w:sz="0" w:space="0" w:color="000000"/>
+                <w:left w:val="none" w:sz="0" w:space="0" w:color="000000"/>
+                <w:right w:val="none" w:sz="0" w:space="0" w:color="000000"/>
+              </w:pBdr>
+              <w:spacing w:after="100" w:before="100" w:line="240"/>
+              <w:ind w:left="100" w:right="100" w:firstLine="0" w:firstLineChars="0"/>
+              <w:rPr>
+                <w:rFonts w:ascii="Times New Roman" w:hAnsi="Arial" w:eastAsia="Arial" w:cs="Arial"/>
+                <w:i w:val="false"/>
+                <w:b w:val="false"/>
+                <w:u w:val="none"/>
+                <w:strike w:val="false"/>
+                <w:sz w:val="24"/>
+                <w:szCs w:val="24"/>
+                <w:color w:val="000000"/>
+              </w:rPr>
+            </w:pPr>
+            <w:r>
+              <w:rPr>
+                <w:rFonts w:ascii="Times New Roman" w:hAnsi="Arial" w:eastAsia="Arial" w:cs="Arial"/>
+                <w:i w:val="false"/>
+                <w:b w:val="false"/>
+                <w:u w:val="none"/>
+                <w:strike w:val="false"/>
+                <w:sz w:val="24"/>
+                <w:szCs w:val="24"/>
+                <w:color w:val="000000"/>
+              </w:rPr>
+              <w:t xml:space="preserve">2020-08-01 (2020-05-01 to 2020-10-01)</w:t>
+            </w:r>
+          </w:p>
+        </w:tc>
+        <w:tc>
+          <w:tcPr>
+            <w:tcBorders>
+              <w:bottom w:val="none" w:sz="0" w:space="0" w:color="000000"/>
+              <w:top w:val="single" w:sz="12" w:space="0" w:color="666666"/>
+              <w:left w:val="none" w:sz="0" w:space="0" w:color="000000"/>
+              <w:right w:val="none" w:sz="0" w:space="0" w:color="000000"/>
+            </w:tcBorders>
+            <w:shd w:val="clear" w:color="auto" w:fill="FFFFFF"/>
+            <w:tcMar>
+              <w:top w:w="0" w:type="dxa"/>
+              <w:bottom w:w="0" w:type="dxa"/>
+              <w:left w:w="0" w:type="dxa"/>
+              <w:right w:w="0" w:type="dxa"/>
+            </w:tcMar>
+            <w:vAlign w:val="center"/>
+          </w:tcPr>
+          <w:p>
+            <w:pPr>
+              <w:pStyle w:val="Normal"/>
+              <w:jc w:val="left"/>
+              <w:pBdr>
+                <w:bottom w:val="none" w:sz="0" w:space="0" w:color="000000"/>
+                <w:top w:val="none" w:sz="0" w:space="0" w:color="000000"/>
+                <w:left w:val="none" w:sz="0" w:space="0" w:color="000000"/>
+                <w:right w:val="none" w:sz="0" w:space="0" w:color="000000"/>
+              </w:pBdr>
+              <w:spacing w:after="100" w:before="100" w:line="240"/>
+              <w:ind w:left="100" w:right="100" w:firstLine="0" w:firstLineChars="0"/>
+              <w:rPr>
+                <w:rFonts w:ascii="Times New Roman" w:hAnsi="Arial" w:eastAsia="Arial" w:cs="Arial"/>
+                <w:i w:val="false"/>
+                <w:b w:val="false"/>
+                <w:u w:val="none"/>
+                <w:strike w:val="false"/>
+                <w:sz w:val="24"/>
+                <w:szCs w:val="24"/>
+                <w:color w:val="000000"/>
+              </w:rPr>
+            </w:pPr>
+            <w:r>
+              <w:rPr>
+                <w:rFonts w:ascii="Times New Roman" w:hAnsi="Arial" w:eastAsia="Arial" w:cs="Arial"/>
+                <w:i w:val="false"/>
+                <w:b w:val="false"/>
+                <w:u w:val="none"/>
+                <w:strike w:val="false"/>
+                <w:sz w:val="24"/>
+                <w:szCs w:val="24"/>
+                <w:color w:val="000000"/>
+              </w:rPr>
+              <w:t xml:space="preserve">20.38% (4.03% to 39.29%)</w:t>
+            </w:r>
+          </w:p>
+        </w:tc>
+        <w:tc>
+          <w:tcPr>
+            <w:tcBorders>
+              <w:bottom w:val="none" w:sz="0" w:space="0" w:color="000000"/>
+              <w:top w:val="single" w:sz="12" w:space="0" w:color="666666"/>
+              <w:left w:val="none" w:sz="0" w:space="0" w:color="000000"/>
+              <w:right w:val="none" w:sz="0" w:space="0" w:color="000000"/>
+            </w:tcBorders>
+            <w:shd w:val="clear" w:color="auto" w:fill="FFFFFF"/>
+            <w:tcMar>
+              <w:top w:w="0" w:type="dxa"/>
+              <w:bottom w:w="0" w:type="dxa"/>
+              <w:left w:w="0" w:type="dxa"/>
+              <w:right w:w="0" w:type="dxa"/>
+            </w:tcMar>
+            <w:vAlign w:val="center"/>
+          </w:tcPr>
+          <w:p>
+            <w:pPr>
+              <w:pStyle w:val="Normal"/>
+              <w:jc w:val="left"/>
+              <w:pBdr>
+                <w:bottom w:val="none" w:sz="0" w:space="0" w:color="000000"/>
+                <w:top w:val="none" w:sz="0" w:space="0" w:color="000000"/>
+                <w:left w:val="none" w:sz="0" w:space="0" w:color="000000"/>
+                <w:right w:val="none" w:sz="0" w:space="0" w:color="000000"/>
+              </w:pBdr>
+              <w:spacing w:after="100" w:before="100" w:line="240"/>
+              <w:ind w:left="100" w:right="100" w:firstLine="0" w:firstLineChars="0"/>
+              <w:rPr>
+                <w:rFonts w:ascii="Times New Roman" w:hAnsi="Arial" w:eastAsia="Arial" w:cs="Arial"/>
+                <w:i w:val="false"/>
+                <w:b w:val="false"/>
+                <w:u w:val="none"/>
+                <w:strike w:val="false"/>
+                <w:sz w:val="24"/>
+                <w:szCs w:val="24"/>
+                <w:color w:val="000000"/>
+              </w:rPr>
+            </w:pPr>
+            <w:r>
+              <w:rPr>
+                <w:rFonts w:ascii="Times New Roman" w:hAnsi="Arial" w:eastAsia="Arial" w:cs="Arial"/>
+                <w:i w:val="false"/>
+                <w:b w:val="false"/>
+                <w:u w:val="none"/>
+                <w:strike w:val="false"/>
+                <w:sz w:val="24"/>
+                <w:szCs w:val="24"/>
+                <w:color w:val="000000"/>
+              </w:rPr>
+              <w:t xml:space="preserve"/>
+            </w:r>
+          </w:p>
+        </w:tc>
+        <w:tc>
+          <w:tcPr>
+            <w:tcBorders>
+              <w:bottom w:val="none" w:sz="0" w:space="0" w:color="000000"/>
+              <w:top w:val="single" w:sz="12" w:space="0" w:color="666666"/>
+              <w:left w:val="none" w:sz="0" w:space="0" w:color="000000"/>
+              <w:right w:val="none" w:sz="0" w:space="0" w:color="000000"/>
+            </w:tcBorders>
+            <w:shd w:val="clear" w:color="auto" w:fill="FFFFFF"/>
+            <w:tcMar>
+              <w:top w:w="0" w:type="dxa"/>
+              <w:bottom w:w="0" w:type="dxa"/>
+              <w:left w:w="0" w:type="dxa"/>
+              <w:right w:w="0" w:type="dxa"/>
+            </w:tcMar>
+            <w:vAlign w:val="center"/>
+          </w:tcPr>
+          <w:p>
+            <w:pPr>
+              <w:pStyle w:val="Normal"/>
+              <w:jc w:val="left"/>
+              <w:pBdr>
+                <w:bottom w:val="none" w:sz="0" w:space="0" w:color="000000"/>
+                <w:top w:val="none" w:sz="0" w:space="0" w:color="000000"/>
+                <w:left w:val="none" w:sz="0" w:space="0" w:color="000000"/>
+                <w:right w:val="none" w:sz="0" w:space="0" w:color="000000"/>
+              </w:pBdr>
+              <w:spacing w:after="100" w:before="100" w:line="240"/>
+              <w:ind w:left="100" w:right="100" w:firstLine="0" w:firstLineChars="0"/>
+              <w:rPr>
+                <w:rFonts w:ascii="Times New Roman" w:hAnsi="Arial" w:eastAsia="Arial" w:cs="Arial"/>
+                <w:i w:val="false"/>
+                <w:b w:val="false"/>
+                <w:u w:val="none"/>
+                <w:strike w:val="false"/>
+                <w:sz w:val="24"/>
+                <w:szCs w:val="24"/>
+                <w:color w:val="000000"/>
+              </w:rPr>
+            </w:pPr>
+            <w:r>
+              <w:rPr>
+                <w:rFonts w:ascii="Times New Roman" w:hAnsi="Arial" w:eastAsia="Arial" w:cs="Arial"/>
+                <w:i w:val="false"/>
+                <w:b w:val="false"/>
+                <w:u w:val="none"/>
+                <w:strike w:val="false"/>
+                <w:sz w:val="24"/>
+                <w:szCs w:val="24"/>
+                <w:color w:val="000000"/>
+              </w:rPr>
+              <w:t xml:space="preserve"/>
+            </w:r>
+          </w:p>
+        </w:tc>
+      </w:tr>
+      <w:tr>
+        <w:trPr>
+          <w:trHeight w:val="360" w:hRule="auto"/>
+        </w:trPr>
+        <w:tc>
+          <w:tcPr>
+            <w:tcBorders>
               <w:bottom w:val="single" w:sz="12" w:space="0" w:color="666666"/>
               <w:top w:val="none" w:sz="0" w:space="0" w:color="000000"/>
               <w:left w:val="none" w:sz="0" w:space="0" w:color="000000"/>
@@ -1993,7 +2328,7 @@
                 <w:szCs w:val="24"/>
                 <w:color w:val="000000"/>
               </w:rPr>
-              <w:t xml:space="preserve">-13.34% (-25.11% to 0.28%)</w:t>
+              <w:t xml:space="preserve"/>
             </w:r>
           </w:p>
         </w:tc>
@@ -2048,7 +2383,7 @@
                 <w:szCs w:val="24"/>
                 <w:color w:val="000000"/>
               </w:rPr>
-              <w:t xml:space="preserve">0.163</w:t>
+              <w:t xml:space="preserve"/>
             </w:r>
           </w:p>
         </w:tc>

</xml_diff>